<commit_message>
feat: rename name_gen, add documents and fix organization editing
- rename name_gen to name_short
- add document management
- fix organization save/cancel workflow
- restrict postal code input to positive integers
</commit_message>
<xml_diff>
--- a/src/main/resources/template/tagtemplate.docx
+++ b/src/main/resources/template/tagtemplate.docx
@@ -2,6 +2,8 @@
 <file path=word/document.xml><?xml version="1.0" encoding="utf-8"?>
 <w:document xmlns:wpc="http://schemas.microsoft.com/office/word/2010/wordprocessingCanvas" xmlns:cx="http://schemas.microsoft.com/office/drawing/2014/chartex" xmlns:cx1="http://schemas.microsoft.com/office/drawing/2015/9/8/chartex" xmlns:cx2="http://schemas.microsoft.com/office/drawing/2015/10/21/chartex" xmlns:cx3="http://schemas.microsoft.com/office/drawing/2016/5/9/chartex" xmlns:cx4="http://schemas.microsoft.com/office/drawing/2016/5/10/chartex" xmlns:cx5="http://schemas.microsoft.com/office/drawing/2016/5/11/chartex" xmlns:cx6="http://schemas.microsoft.com/office/drawing/2016/5/12/chartex" xmlns:cx7="http://schemas.microsoft.com/office/drawing/2016/5/13/chartex" xmlns:cx8="http://schemas.microsoft.com/office/drawing/2016/5/14/chartex" xmlns:mc="http://schemas.openxmlformats.org/markup-compatibility/2006" xmlns:aink="http://schemas.microsoft.com/office/drawing/2016/ink" xmlns:am3d="http://schemas.microsoft.com/office/drawing/2017/model3d" xmlns:o="urn:schemas-microsoft-com:office:office" xmlns:r="http://schemas.openxmlformats.org/officeDocument/2006/relationships" xmlns:m="http://schemas.openxmlformats.org/officeDocument/2006/math" xmlns:v="urn:schemas-microsoft-com:vml" xmlns:wp14="http://schemas.microsoft.com/office/word/2010/wordprocessingDrawing" xmlns:wp="http://schemas.openxmlformats.org/drawingml/2006/wordprocessingDrawing" xmlns:w10="urn:schemas-microsoft-com:office:word" xmlns:w="http://schemas.openxmlformats.org/wordprocessingml/2006/main" xmlns:w14="http://schemas.microsoft.com/office/word/2010/wordml" xmlns:w15="http://schemas.microsoft.com/office/word/2012/wordml" xmlns:w16cex="http://schemas.microsoft.com/office/word/2018/wordml/cex" xmlns:w16cid="http://schemas.microsoft.com/office/word/2016/wordml/cid" xmlns:w16="http://schemas.microsoft.com/office/word/2018/wordml" xmlns:w16se="http://schemas.microsoft.com/office/word/2015/wordml/symex" xmlns:wpg="http://schemas.microsoft.com/office/word/2010/wordprocessingGroup" xmlns:wpi="http://schemas.microsoft.com/office/word/2010/wordprocessingInk" xmlns:wne="http://schemas.microsoft.com/office/word/2006/wordml" xmlns:wps="http://schemas.microsoft.com/office/word/2010/wordprocessingShape" mc:Ignorable="w14 w15 w16se w16cid w16 w16cex wp14">
   <w:body>
+    <w:bookmarkStart w:id="0" w:name="_GoBack" w:displacedByCustomXml="next"/>
+    <w:bookmarkEnd w:id="0" w:displacedByCustomXml="next"/>
     <w:sdt>
       <w:sdtPr>
         <w:rPr>
@@ -19,6 +21,7 @@
         </w:placeholder>
         <w:text/>
       </w:sdtPr>
+      <w:sdtEndPr/>
       <w:sdtContent>
         <w:p>
           <w:pPr>
@@ -142,6 +145,7 @@
               </w:placeholder>
               <w:text/>
             </w:sdtPr>
+            <w:sdtEndPr/>
             <w:sdtContent>
               <w:p>
                 <w:pPr>
@@ -177,6 +181,7 @@
               </w:placeholder>
               <w:text/>
             </w:sdtPr>
+            <w:sdtEndPr/>
             <w:sdtContent>
               <w:p>
                 <w:pPr>
@@ -248,6 +253,7 @@
               </w:placeholder>
               <w:text/>
             </w:sdtPr>
+            <w:sdtEndPr/>
             <w:sdtContent>
               <w:p>
                 <w:pPr>
@@ -284,6 +290,7 @@
               </w:placeholder>
               <w:text/>
             </w:sdtPr>
+            <w:sdtEndPr/>
             <w:sdtContent>
               <w:p>
                 <w:pPr>
@@ -354,6 +361,7 @@
                 </w:placeholder>
                 <w:text/>
               </w:sdtPr>
+              <w:sdtEndPr/>
               <w:sdtContent>
                 <w:r>
                   <w:rPr>
@@ -446,6 +454,7 @@
                 </w:placeholder>
                 <w:text/>
               </w:sdtPr>
+              <w:sdtEndPr/>
               <w:sdtContent>
                 <w:r>
                   <w:rPr>
@@ -656,6 +665,7 @@
         </w:placeholder>
         <w:text/>
       </w:sdtPr>
+      <w:sdtEndPr/>
       <w:sdtContent>
         <w:p>
           <w:pPr>
@@ -936,7 +946,7 @@
         </w:sectPr>
       </w:pPr>
     </w:p>
-    <w:bookmarkStart w:id="0" w:name="_Toc514252613" w:displacedByCustomXml="next"/>
+    <w:bookmarkStart w:id="1" w:name="_Toc514252613" w:displacedByCustomXml="next"/>
     <w:sdt>
       <w:sdtPr>
         <w:rPr>
@@ -953,6 +963,7 @@
           <w:docPartUnique/>
         </w:docPartObj>
       </w:sdtPr>
+      <w:sdtEndPr/>
       <w:sdtContent>
         <w:p>
           <w:pPr>
@@ -3385,8 +3396,8 @@
           <w:color w:val="auto"/>
         </w:rPr>
       </w:pPr>
-      <w:bookmarkStart w:id="1" w:name="_Toc209703483"/>
-      <w:bookmarkStart w:id="2" w:name="_Toc221000956"/>
+      <w:bookmarkStart w:id="2" w:name="_Toc209703483"/>
+      <w:bookmarkStart w:id="3" w:name="_Toc221000956"/>
       <w:r>
         <w:rPr>
           <w:rFonts w:eastAsia="MS Gothic"/>
@@ -3395,9 +3406,9 @@
         <w:lastRenderedPageBreak/>
         <w:t>Принятые сокращения</w:t>
       </w:r>
-      <w:bookmarkEnd w:id="0"/>
       <w:bookmarkEnd w:id="1"/>
       <w:bookmarkEnd w:id="2"/>
+      <w:bookmarkEnd w:id="3"/>
     </w:p>
     <w:p>
       <w:pPr>
@@ -4741,8 +4752,8 @@
           <w:color w:val="auto"/>
         </w:rPr>
       </w:pPr>
-      <w:bookmarkStart w:id="3" w:name="_Toc209703484"/>
-      <w:bookmarkStart w:id="4" w:name="_Toc221000957"/>
+      <w:bookmarkStart w:id="4" w:name="_Toc209703484"/>
+      <w:bookmarkStart w:id="5" w:name="_Toc221000957"/>
       <w:r>
         <w:rPr>
           <w:color w:val="auto"/>
@@ -4750,8 +4761,8 @@
         <w:lastRenderedPageBreak/>
         <w:t>Введение</w:t>
       </w:r>
-      <w:bookmarkEnd w:id="3"/>
       <w:bookmarkEnd w:id="4"/>
+      <w:bookmarkEnd w:id="5"/>
     </w:p>
     <w:p>
       <w:pPr>
@@ -4779,6 +4790,7 @@
           </w:placeholder>
           <w:text/>
         </w:sdtPr>
+        <w:sdtEndPr/>
         <w:sdtContent>
           <w:r>
             <w:rPr>
@@ -5345,6 +5357,7 @@
           </w:placeholder>
           <w:text/>
         </w:sdtPr>
+        <w:sdtEndPr/>
         <w:sdtContent>
           <w:r>
             <w:rPr>
@@ -5397,9 +5410,9 @@
           <w:szCs w:val="32"/>
         </w:rPr>
       </w:pPr>
-      <w:bookmarkStart w:id="5" w:name="_Toc392754505"/>
-      <w:bookmarkStart w:id="6" w:name="_Toc209703485"/>
-      <w:bookmarkStart w:id="7" w:name="_Toc221000958"/>
+      <w:bookmarkStart w:id="6" w:name="_Toc392754505"/>
+      <w:bookmarkStart w:id="7" w:name="_Toc209703485"/>
+      <w:bookmarkStart w:id="8" w:name="_Toc221000958"/>
       <w:r>
         <w:rPr>
           <w:rFonts w:ascii="Times New Roman" w:hAnsi="Times New Roman"/>
@@ -5411,37 +5424,37 @@
         <w:lastRenderedPageBreak/>
         <w:t>Общие разделы плана мероприятий</w:t>
       </w:r>
-      <w:bookmarkEnd w:id="5"/>
       <w:bookmarkEnd w:id="6"/>
       <w:bookmarkEnd w:id="7"/>
+      <w:bookmarkEnd w:id="8"/>
     </w:p>
     <w:p>
       <w:pPr>
         <w:pStyle w:val="2a"/>
       </w:pPr>
-      <w:bookmarkStart w:id="8" w:name="_Toc297113967"/>
-      <w:bookmarkStart w:id="9" w:name="_Toc333577397"/>
-      <w:bookmarkStart w:id="10" w:name="_Toc368475298"/>
-      <w:bookmarkStart w:id="11" w:name="_Toc374546478"/>
-      <w:bookmarkStart w:id="12" w:name="_Toc392754506"/>
-      <w:bookmarkStart w:id="13" w:name="_Toc209703486"/>
-      <w:bookmarkStart w:id="14" w:name="_Toc221000959"/>
+      <w:bookmarkStart w:id="9" w:name="_Toc297113967"/>
+      <w:bookmarkStart w:id="10" w:name="_Toc333577397"/>
+      <w:bookmarkStart w:id="11" w:name="_Toc368475298"/>
+      <w:bookmarkStart w:id="12" w:name="_Toc374546478"/>
+      <w:bookmarkStart w:id="13" w:name="_Toc392754506"/>
+      <w:bookmarkStart w:id="14" w:name="_Toc209703486"/>
+      <w:bookmarkStart w:id="15" w:name="_Toc221000959"/>
       <w:r>
         <w:t>1. Характеристика объекта</w:t>
       </w:r>
-      <w:bookmarkEnd w:id="8"/>
       <w:bookmarkEnd w:id="9"/>
       <w:bookmarkEnd w:id="10"/>
       <w:bookmarkEnd w:id="11"/>
+      <w:bookmarkEnd w:id="12"/>
       <w:r>
         <w:t xml:space="preserve">, в отношении которого разрабатывается </w:t>
       </w:r>
-      <w:bookmarkEnd w:id="12"/>
       <w:bookmarkEnd w:id="13"/>
+      <w:bookmarkEnd w:id="14"/>
       <w:r>
         <w:t>ПМЛЛПА</w:t>
       </w:r>
-      <w:bookmarkEnd w:id="14"/>
+      <w:bookmarkEnd w:id="15"/>
     </w:p>
     <w:p>
       <w:pPr>
@@ -5473,6 +5486,7 @@
           </w:placeholder>
           <w:text/>
         </w:sdtPr>
+        <w:sdtEndPr/>
         <w:sdtContent>
           <w:r>
             <w:t>${OBJ_ADDRESS_FULL}</w:t>
@@ -5497,24 +5511,13 @@
           </w:placeholder>
           <w:text/>
         </w:sdtPr>
+        <w:sdtEndPr/>
         <w:sdtContent>
           <w:r>
             <w:rPr>
               <w:lang w:val="en-US"/>
             </w:rPr>
-            <w:t>${</w:t>
-          </w:r>
-          <w:r>
-            <w:rPr>
-              <w:lang w:val="en-US"/>
-            </w:rPr>
-            <w:t>OBJ_LINC_TEXT_1_IMAGE</w:t>
-          </w:r>
-          <w:r>
-            <w:rPr>
-              <w:lang w:val="en-US"/>
-            </w:rPr>
-            <w:t>}</w:t>
+            <w:t>${OBJ_LINC_TEXT_1_IMAGE}</w:t>
           </w:r>
         </w:sdtContent>
       </w:sdt>
@@ -5536,24 +5539,13 @@
           </w:placeholder>
           <w:text/>
         </w:sdtPr>
+        <w:sdtEndPr/>
         <w:sdtContent>
           <w:r>
             <w:rPr>
               <w:lang w:val="en-US"/>
             </w:rPr>
-            <w:t>${</w:t>
-          </w:r>
-          <w:r>
-            <w:rPr>
-              <w:lang w:val="en-US"/>
-            </w:rPr>
-            <w:t>OBJ_NUM_1_IMAGE</w:t>
-          </w:r>
-          <w:r>
-            <w:rPr>
-              <w:lang w:val="en-US"/>
-            </w:rPr>
-            <w:t>}</w:t>
+            <w:t>${OBJ_NUM_1_IMAGE}</w:t>
           </w:r>
         </w:sdtContent>
       </w:sdt>
@@ -5619,6 +5611,7 @@
           </w:placeholder>
           <w:text/>
         </w:sdtPr>
+        <w:sdtEndPr/>
         <w:sdtContent>
           <w:r>
             <w:rPr>
@@ -5667,6 +5660,7 @@
           </w:placeholder>
           <w:text/>
         </w:sdtPr>
+        <w:sdtEndPr/>
         <w:sdtContent>
           <w:r>
             <w:rPr>
@@ -5740,6 +5734,7 @@
           </w:placeholder>
           <w:text/>
         </w:sdtPr>
+        <w:sdtEndPr/>
         <w:sdtContent>
           <w:r>
             <w:rPr>
@@ -5821,6 +5816,7 @@
           </w:placeholder>
           <w:text/>
         </w:sdtPr>
+        <w:sdtEndPr/>
         <w:sdtContent>
           <w:r>
             <w:rPr>
@@ -5870,6 +5866,7 @@
           </w:placeholder>
           <w:text/>
         </w:sdtPr>
+        <w:sdtEndPr/>
         <w:sdtContent>
           <w:r>
             <w:rPr>
@@ -5911,6 +5908,7 @@
           </w:placeholder>
           <w:text/>
         </w:sdtPr>
+        <w:sdtEndPr/>
         <w:sdtContent>
           <w:r>
             <w:rPr>
@@ -5996,48 +5994,32 @@
         <w:t>ОПО</w:t>
       </w:r>
       <w:r>
-        <w:rPr>
-          <w:lang w:val="en-US"/>
-        </w:rPr>
         <w:t xml:space="preserve"> </w:t>
       </w:r>
       <w:r>
         <w:t>можно</w:t>
       </w:r>
       <w:r>
-        <w:rPr>
-          <w:lang w:val="en-US"/>
-        </w:rPr>
         <w:t xml:space="preserve"> </w:t>
       </w:r>
       <w:r>
         <w:t>условно</w:t>
       </w:r>
       <w:r>
-        <w:rPr>
-          <w:lang w:val="en-US"/>
-        </w:rPr>
         <w:t xml:space="preserve"> </w:t>
       </w:r>
       <w:r>
         <w:t>разделить</w:t>
       </w:r>
       <w:r>
-        <w:rPr>
-          <w:lang w:val="en-US"/>
-        </w:rPr>
         <w:t xml:space="preserve"> </w:t>
       </w:r>
       <w:r>
         <w:t>на</w:t>
       </w:r>
       <w:r>
-        <w:rPr>
-          <w:lang w:val="en-US"/>
-        </w:rPr>
         <w:t xml:space="preserve"> </w:t>
       </w:r>
-      <w:bookmarkStart w:id="15" w:name="_GoBack"/>
       <w:sdt>
         <w:sdtPr>
           <w:tag w:val="OBJ_AMOUNT_TECHNOLOGICAL_BLOCK"/>
@@ -6047,6 +6029,7 @@
           </w:placeholder>
           <w:text/>
         </w:sdtPr>
+        <w:sdtEndPr/>
         <w:sdtContent>
           <w:r>
             <w:t>${OBJ_AMOUNT_TECHNOLOGICAL_BLOCK}</w:t>
@@ -6063,15 +6046,23 @@
     <w:p>
       <w:pPr>
         <w:spacing w:after="0" w:line="240" w:lineRule="auto"/>
-      </w:pPr>
-      <w:r>
+        <w:rPr>
+          <w:lang w:val="en-US"/>
+        </w:rPr>
+      </w:pPr>
+      <w:r>
+        <w:rPr>
+          <w:lang w:val="en-US"/>
+        </w:rPr>
         <w:t>OBJ_TECHNO_BLOCK_LIST</w:t>
       </w:r>
       <w:r>
+        <w:rPr>
+          <w:lang w:val="en-US"/>
+        </w:rPr>
         <w:t>№</w:t>
       </w:r>
     </w:p>
-    <w:bookmarkEnd w:id="15"/>
     <w:p>
       <w:pPr>
         <w:spacing w:after="0" w:line="240" w:lineRule="auto"/>
@@ -6086,6 +6077,7 @@
         <w:ind w:firstLine="708"/>
         <w:rPr>
           <w:bCs/>
+          <w:lang w:val="en-US"/>
         </w:rPr>
         <w:sectPr>
           <w:pgSz w:w="11906" w:h="16838"/>
@@ -6096,6 +6088,9 @@
       </w:pPr>
       <w:sdt>
         <w:sdtPr>
+          <w:rPr>
+            <w:lang w:val="en-US"/>
+          </w:rPr>
           <w:tag w:val="OBJ_LINC_TEXT_2_IMAGE"/>
           <w:id w:val="935785831"/>
           <w:placeholder>
@@ -6103,17 +6098,27 @@
           </w:placeholder>
           <w:text/>
         </w:sdtPr>
+        <w:sdtEndPr/>
         <w:sdtContent>
           <w:r>
+            <w:rPr>
+              <w:lang w:val="en-US"/>
+            </w:rPr>
             <w:t>${OBJ_LINC_TEXT_2_IMAGE}</w:t>
           </w:r>
         </w:sdtContent>
       </w:sdt>
       <w:r>
+        <w:rPr>
+          <w:lang w:val="en-US"/>
+        </w:rPr>
         <w:t xml:space="preserve"> </w:t>
       </w:r>
       <w:sdt>
         <w:sdtPr>
+          <w:rPr>
+            <w:lang w:val="en-US"/>
+          </w:rPr>
           <w:tag w:val="OBJ_NUM_2_IMAGE"/>
           <w:id w:val="-472054734"/>
           <w:placeholder>
@@ -6121,13 +6126,20 @@
           </w:placeholder>
           <w:text/>
         </w:sdtPr>
+        <w:sdtEndPr/>
         <w:sdtContent>
           <w:r>
+            <w:rPr>
+              <w:lang w:val="en-US"/>
+            </w:rPr>
             <w:t>${OBJ_NUM_2_IMAGE}</w:t>
           </w:r>
         </w:sdtContent>
       </w:sdt>
       <w:r>
+        <w:rPr>
+          <w:lang w:val="en-US"/>
+        </w:rPr>
         <w:t>.</w:t>
       </w:r>
     </w:p>
@@ -6149,9 +6161,15 @@
         <w:spacing w:after="0" w:line="240" w:lineRule="auto"/>
         <w:ind w:firstLine="709"/>
         <w:jc w:val="both"/>
+        <w:rPr>
+          <w:lang w:val="en-US"/>
+        </w:rPr>
       </w:pPr>
       <w:sdt>
         <w:sdtPr>
+          <w:rPr>
+            <w:lang w:val="en-US"/>
+          </w:rPr>
           <w:tag w:val="OBJ_LINC_TEXT_1_TABLE"/>
           <w:id w:val="-314417629"/>
           <w:placeholder>
@@ -6159,17 +6177,27 @@
           </w:placeholder>
           <w:text/>
         </w:sdtPr>
+        <w:sdtEndPr/>
         <w:sdtContent>
           <w:r>
+            <w:rPr>
+              <w:lang w:val="en-US"/>
+            </w:rPr>
             <w:t>${OBJ_LINC_TEXT_1_TABLE}</w:t>
           </w:r>
         </w:sdtContent>
       </w:sdt>
       <w:r>
+        <w:rPr>
+          <w:lang w:val="en-US"/>
+        </w:rPr>
         <w:t xml:space="preserve"> </w:t>
       </w:r>
       <w:sdt>
         <w:sdtPr>
+          <w:rPr>
+            <w:lang w:val="en-US"/>
+          </w:rPr>
           <w:tag w:val="OBJ_NUM_1_TABLE"/>
           <w:id w:val="2015337340"/>
           <w:placeholder>
@@ -6177,13 +6205,20 @@
           </w:placeholder>
           <w:text/>
         </w:sdtPr>
+        <w:sdtEndPr/>
         <w:sdtContent>
           <w:r>
+            <w:rPr>
+              <w:lang w:val="en-US"/>
+            </w:rPr>
             <w:t>${OBJ_NUM_1_TABLE}</w:t>
           </w:r>
         </w:sdtContent>
       </w:sdt>
       <w:r>
+        <w:rPr>
+          <w:lang w:val="en-US"/>
+        </w:rPr>
         <w:t>.</w:t>
       </w:r>
     </w:p>
@@ -6192,6 +6227,9 @@
         <w:spacing w:after="0" w:line="240" w:lineRule="auto"/>
         <w:ind w:firstLine="709"/>
         <w:jc w:val="both"/>
+        <w:rPr>
+          <w:lang w:val="en-US"/>
+        </w:rPr>
       </w:pPr>
     </w:p>
     <w:p>
@@ -6214,6 +6252,9 @@
       </w:r>
       <w:sdt>
         <w:sdtPr>
+          <w:rPr>
+            <w:lang w:val="en-US"/>
+          </w:rPr>
           <w:tag w:val="OBJ_NUM_1_TABLE"/>
           <w:id w:val="606242610"/>
           <w:placeholder>
@@ -6221,17 +6262,27 @@
           </w:placeholder>
           <w:text/>
         </w:sdtPr>
+        <w:sdtEndPr/>
         <w:sdtContent>
           <w:r>
+            <w:rPr>
+              <w:lang w:val="en-US"/>
+            </w:rPr>
             <w:t>${OBJ_NUM_1_TABLE}</w:t>
           </w:r>
         </w:sdtContent>
       </w:sdt>
       <w:r>
+        <w:rPr>
+          <w:lang w:val="en-US"/>
+        </w:rPr>
         <w:t xml:space="preserve"> – </w:t>
       </w:r>
       <w:sdt>
         <w:sdtPr>
+          <w:rPr>
+            <w:lang w:val="en-US"/>
+          </w:rPr>
           <w:tag w:val="OBJ_TEXT_NAME_1_TABLE"/>
           <w:id w:val="1895999250"/>
           <w:placeholder>
@@ -6239,8 +6290,12 @@
           </w:placeholder>
           <w:text/>
         </w:sdtPr>
+        <w:sdtEndPr/>
         <w:sdtContent>
           <w:r>
+            <w:rPr>
+              <w:lang w:val="en-US"/>
+            </w:rPr>
             <w:t>${OBJ_TEXT_NAME_1_TABLE}</w:t>
           </w:r>
         </w:sdtContent>
@@ -6443,6 +6498,7 @@
           </w:placeholder>
           <w:text/>
         </w:sdtPr>
+        <w:sdtEndPr/>
         <w:sdtContent>
           <w:r>
             <w:t>${OBJ_AMOUNT_HAZARDOUS_SUBSTANCE}</w:t>
@@ -6508,12 +6564,35 @@
           </w:placeholder>
           <w:text/>
         </w:sdtPr>
+        <w:sdtEndPr/>
         <w:sdtContent>
           <w:r>
             <w:t>${OBJ_HAZARDOUS_SUBSTANCE}</w:t>
           </w:r>
         </w:sdtContent>
       </w:sdt>
+      <w:r>
+        <w:t xml:space="preserve"> (далее </w:t>
+      </w:r>
+      <w:sdt>
+        <w:sdtPr>
+          <w:tag w:val="OBJ_HAZARDOUS_SUBSTANCE_SHORT"/>
+          <w:id w:val="1241754758"/>
+          <w:placeholder>
+            <w:docPart w:val="BE5808D8654F4D4D8ADF8498985F0C13"/>
+          </w:placeholder>
+          <w:text/>
+        </w:sdtPr>
+        <w:sdtEndPr/>
+        <w:sdtContent>
+          <w:r>
+            <w:t>${OBJ_HAZARDOUS_SUBSTANCE_SHORT}</w:t>
+          </w:r>
+        </w:sdtContent>
+      </w:sdt>
+      <w:r>
+        <w:t>)</w:t>
+      </w:r>
       <w:r>
         <w:t xml:space="preserve"> </w:t>
       </w:r>
@@ -6526,15 +6605,10 @@
           </w:placeholder>
           <w:text/>
         </w:sdtPr>
+        <w:sdtEndPr/>
         <w:sdtContent>
           <w:r>
-            <w:t>${OBJ_LINC_TEXT_</w:t>
-          </w:r>
-          <w:r>
-            <w:t>2</w:t>
-          </w:r>
-          <w:r>
-            <w:t>_TABLE}</w:t>
+            <w:t>${OBJ_LINC_TEXT_2_TABLE}</w:t>
           </w:r>
         </w:sdtContent>
       </w:sdt>
@@ -6550,6 +6624,7 @@
           </w:placeholder>
           <w:text/>
         </w:sdtPr>
+        <w:sdtEndPr/>
         <w:sdtContent>
           <w:r>
             <w:t>${OBJ_NUM_2_TABLE}</w:t>
@@ -6596,30 +6671,13 @@
           </w:placeholder>
           <w:text/>
         </w:sdtPr>
+        <w:sdtEndPr/>
         <w:sdtContent>
           <w:r>
             <w:rPr>
               <w:lang w:val="en-US"/>
             </w:rPr>
-            <w:t>${OBJ_NUM_</w:t>
-          </w:r>
-          <w:r>
-            <w:rPr>
-              <w:lang w:val="en-US"/>
-            </w:rPr>
-            <w:t>2</w:t>
-          </w:r>
-          <w:r>
-            <w:rPr>
-              <w:lang w:val="en-US"/>
-            </w:rPr>
-            <w:t>_TABLE</w:t>
-          </w:r>
-          <w:r>
-            <w:rPr>
-              <w:lang w:val="en-US"/>
-            </w:rPr>
-            <w:t>}</w:t>
+            <w:t>${OBJ_NUM_2_TABLE}</w:t>
           </w:r>
         </w:sdtContent>
       </w:sdt>
@@ -6641,36 +6699,13 @@
           </w:placeholder>
           <w:text/>
         </w:sdtPr>
+        <w:sdtEndPr/>
         <w:sdtContent>
           <w:r>
             <w:rPr>
               <w:lang w:val="en-US"/>
             </w:rPr>
-            <w:t>${</w:t>
-          </w:r>
-          <w:r>
-            <w:rPr>
-              <w:lang w:val="en-US"/>
-            </w:rPr>
-            <w:t>OBJ_TEXT_NAME_</w:t>
-          </w:r>
-          <w:r>
-            <w:rPr>
-              <w:lang w:val="en-US"/>
-            </w:rPr>
-            <w:t>2</w:t>
-          </w:r>
-          <w:r>
-            <w:rPr>
-              <w:lang w:val="en-US"/>
-            </w:rPr>
-            <w:t>_TABLE</w:t>
-          </w:r>
-          <w:r>
-            <w:rPr>
-              <w:lang w:val="en-US"/>
-            </w:rPr>
-            <w:t>}</w:t>
+            <w:t>${OBJ_TEXT_NAME_2_TABLE}</w:t>
           </w:r>
         </w:sdtContent>
       </w:sdt>
@@ -6680,6 +6715,7 @@
         </w:rPr>
         <w:t xml:space="preserve"> </w:t>
       </w:r>
+      <w:bookmarkStart w:id="26" w:name="_Hlk235694180"/>
       <w:sdt>
         <w:sdtPr>
           <w:rPr>
@@ -6692,15 +6728,17 @@
           </w:placeholder>
           <w:text/>
         </w:sdtPr>
+        <w:sdtEndPr/>
         <w:sdtContent>
           <w:r>
             <w:rPr>
               <w:lang w:val="en-US"/>
             </w:rPr>
-            <w:t>${OBJ_HAZARDOUS_SUBSTANCE_GEN}</w:t>
+            <w:t>${OBJ_HAZARDOUS_SUBSTANCE_SHORT}</w:t>
           </w:r>
         </w:sdtContent>
       </w:sdt>
+      <w:bookmarkEnd w:id="26"/>
     </w:p>
     <w:p>
       <w:pPr>
@@ -6915,8 +6953,8 @@
       <w:pPr>
         <w:pStyle w:val="2a"/>
       </w:pPr>
-      <w:bookmarkStart w:id="26" w:name="_Toc209703489"/>
-      <w:bookmarkStart w:id="27" w:name="_Toc221000962"/>
+      <w:bookmarkStart w:id="27" w:name="_Toc209703489"/>
+      <w:bookmarkStart w:id="28" w:name="_Toc221000962"/>
       <w:r>
         <w:lastRenderedPageBreak/>
         <w:t>1.3 К</w:t>
@@ -6939,8 +6977,8 @@
       <w:r>
         <w:t>ОПО</w:t>
       </w:r>
-      <w:bookmarkEnd w:id="26"/>
       <w:bookmarkEnd w:id="27"/>
+      <w:bookmarkEnd w:id="28"/>
     </w:p>
     <w:p>
       <w:pPr>
@@ -7021,36 +7059,13 @@
           </w:placeholder>
           <w:text/>
         </w:sdtPr>
+        <w:sdtEndPr/>
         <w:sdtContent>
           <w:r>
             <w:rPr>
               <w:lang w:val="en-US"/>
             </w:rPr>
-            <w:t>${</w:t>
-          </w:r>
-          <w:r>
-            <w:rPr>
-              <w:lang w:val="en-US"/>
-            </w:rPr>
-            <w:t>OBJ_</w:t>
-          </w:r>
-          <w:r>
-            <w:rPr>
-              <w:lang w:val="en-US"/>
-            </w:rPr>
-            <w:t>NUM_1_</w:t>
-          </w:r>
-          <w:r>
-            <w:rPr>
-              <w:lang w:val="en-US"/>
-            </w:rPr>
-            <w:t>IMAGE</w:t>
-          </w:r>
-          <w:r>
-            <w:rPr>
-              <w:lang w:val="en-US"/>
-            </w:rPr>
-            <w:t>}</w:t>
+            <w:t>${OBJ_NUM_1_IMAGE}</w:t>
           </w:r>
         </w:sdtContent>
       </w:sdt>
@@ -7072,30 +7087,13 @@
           </w:placeholder>
           <w:text/>
         </w:sdtPr>
+        <w:sdtEndPr/>
         <w:sdtContent>
           <w:r>
             <w:rPr>
               <w:lang w:val="en-US"/>
             </w:rPr>
-            <w:t>${</w:t>
-          </w:r>
-          <w:r>
-            <w:rPr>
-              <w:lang w:val="en-US"/>
-            </w:rPr>
-            <w:t>OBJ_TEXT_</w:t>
-          </w:r>
-          <w:r>
-            <w:rPr>
-              <w:lang w:val="en-US"/>
-            </w:rPr>
-            <w:t>CAPTURE</w:t>
-          </w:r>
-          <w:r>
-            <w:rPr>
-              <w:lang w:val="en-US"/>
-            </w:rPr>
-            <w:t>_1_IMAGE}</w:t>
+            <w:t>${OBJ_TEXT_CAPTURE_1_IMAGE}</w:t>
           </w:r>
         </w:sdtContent>
       </w:sdt>
@@ -7174,24 +7172,13 @@
           </w:placeholder>
           <w:text/>
         </w:sdtPr>
+        <w:sdtEndPr/>
         <w:sdtContent>
           <w:r>
             <w:rPr>
               <w:lang w:val="en-US"/>
             </w:rPr>
-            <w:t>${</w:t>
-          </w:r>
-          <w:r>
-            <w:rPr>
-              <w:lang w:val="en-US"/>
-            </w:rPr>
-            <w:t>OBJ_</w:t>
-          </w:r>
-          <w:r>
-            <w:rPr>
-              <w:lang w:val="en-US"/>
-            </w:rPr>
-            <w:t>NUM_2_IMAGE}</w:t>
+            <w:t>${OBJ_NUM_2_IMAGE}</w:t>
           </w:r>
         </w:sdtContent>
       </w:sdt>
@@ -7213,24 +7200,13 @@
           </w:placeholder>
           <w:text/>
         </w:sdtPr>
+        <w:sdtEndPr/>
         <w:sdtContent>
           <w:r>
             <w:rPr>
               <w:lang w:val="en-US"/>
             </w:rPr>
-            <w:t>${</w:t>
-          </w:r>
-          <w:r>
-            <w:rPr>
-              <w:lang w:val="en-US"/>
-            </w:rPr>
-            <w:t>OBJ_TEXT_</w:t>
-          </w:r>
-          <w:r>
-            <w:rPr>
-              <w:lang w:val="en-US"/>
-            </w:rPr>
-            <w:t>CAPTURE_2_IMAGE}</w:t>
+            <w:t>${OBJ_TEXT_CAPTURE_2_IMAGE}</w:t>
           </w:r>
         </w:sdtContent>
       </w:sdt>
@@ -7272,33 +7248,33 @@
         <w:pStyle w:val="1"/>
         <w:ind w:firstLine="0"/>
       </w:pPr>
-      <w:bookmarkStart w:id="28" w:name="_Toc392754513"/>
-      <w:bookmarkStart w:id="29" w:name="_Toc430097609"/>
-      <w:bookmarkStart w:id="30" w:name="_Toc430255936"/>
-      <w:bookmarkStart w:id="31" w:name="_Toc209703490"/>
-      <w:bookmarkStart w:id="32" w:name="_Toc221000963"/>
+      <w:bookmarkStart w:id="29" w:name="_Toc392754513"/>
+      <w:bookmarkStart w:id="30" w:name="_Toc430097609"/>
+      <w:bookmarkStart w:id="31" w:name="_Toc430255936"/>
+      <w:bookmarkStart w:id="32" w:name="_Toc209703490"/>
+      <w:bookmarkStart w:id="33" w:name="_Toc221000963"/>
       <w:r>
         <w:lastRenderedPageBreak/>
         <w:t xml:space="preserve">2. Анализ опасности </w:t>
       </w:r>
-      <w:bookmarkEnd w:id="28"/>
       <w:bookmarkEnd w:id="29"/>
       <w:bookmarkEnd w:id="30"/>
       <w:bookmarkEnd w:id="31"/>
+      <w:bookmarkEnd w:id="32"/>
       <w:r>
         <w:t>объекта</w:t>
       </w:r>
-      <w:bookmarkEnd w:id="32"/>
+      <w:bookmarkEnd w:id="33"/>
     </w:p>
     <w:p>
       <w:pPr>
         <w:pStyle w:val="2a"/>
       </w:pPr>
-      <w:bookmarkStart w:id="33" w:name="_Toc392754514"/>
-      <w:bookmarkStart w:id="34" w:name="_Toc430097610"/>
-      <w:bookmarkStart w:id="35" w:name="_Toc430255937"/>
-      <w:bookmarkStart w:id="36" w:name="_Toc209703491"/>
-      <w:bookmarkStart w:id="37" w:name="_Toc221000964"/>
+      <w:bookmarkStart w:id="34" w:name="_Toc392754514"/>
+      <w:bookmarkStart w:id="35" w:name="_Toc430097610"/>
+      <w:bookmarkStart w:id="36" w:name="_Toc430255937"/>
+      <w:bookmarkStart w:id="37" w:name="_Toc209703491"/>
+      <w:bookmarkStart w:id="38" w:name="_Toc221000964"/>
       <w:r>
         <w:t xml:space="preserve">2.1. </w:t>
       </w:r>
@@ -7326,11 +7302,11 @@
       <w:r>
         <w:t xml:space="preserve"> возникновения</w:t>
       </w:r>
-      <w:bookmarkEnd w:id="33"/>
       <w:bookmarkEnd w:id="34"/>
       <w:bookmarkEnd w:id="35"/>
       <w:bookmarkEnd w:id="36"/>
       <w:bookmarkEnd w:id="37"/>
+      <w:bookmarkEnd w:id="38"/>
     </w:p>
     <w:p>
       <w:pPr>
@@ -7353,7 +7329,29 @@
         <w:spacing w:line="240" w:lineRule="auto"/>
       </w:pPr>
       <w:r>
-        <w:t xml:space="preserve">Анализ представленных статистических данных аварийных ситуаций показывает, что основными поражающими факторами в случае аварий с природным газом, обращающимся в технологическом оборудовании </w:t>
+        <w:t>Анализ представленных статистических данных аварийных ситуаций показывает, что основными поражающими факторами в случае аварий с</w:t>
+      </w:r>
+      <w:r>
+        <w:t xml:space="preserve"> </w:t>
+      </w:r>
+      <w:sdt>
+        <w:sdtPr>
+          <w:tag w:val="OBJ_HAZARDOUS_SUBSTANCE_GEN"/>
+          <w:id w:val="-2118049700"/>
+          <w:placeholder>
+            <w:docPart w:val="92A3724C014543AFABF462BE25EDA8B5"/>
+          </w:placeholder>
+          <w:text/>
+        </w:sdtPr>
+        <w:sdtEndPr/>
+        <w:sdtContent>
+          <w:r>
+            <w:t>${OBJ_HAZARDOUS_SUBSTANCE_SHORT}</w:t>
+          </w:r>
+        </w:sdtContent>
+      </w:sdt>
+      <w:r>
+        <w:t xml:space="preserve">, обращающимся в технологическом оборудовании </w:t>
       </w:r>
       <w:r>
         <w:t>Объекта</w:t>
@@ -7368,7 +7366,26 @@
         <w:spacing w:line="240" w:lineRule="auto"/>
       </w:pPr>
       <w:r>
-        <w:t>Потенциальную опасность представляет технологическое оборудование с опасным веществом (природным газом).</w:t>
+        <w:t>Потенциальную опасность представляет технологическое оборудование с опасным веществом(</w:t>
+      </w:r>
+      <w:sdt>
+        <w:sdtPr>
+          <w:tag w:val="OBJ_HAZARDOUS_SUBSTANCE_INST"/>
+          <w:id w:val="1258868037"/>
+          <w:placeholder>
+            <w:docPart w:val="DefaultPlaceholder_-1854013440"/>
+          </w:placeholder>
+          <w:text/>
+        </w:sdtPr>
+        <w:sdtEndPr/>
+        <w:sdtContent>
+          <w:r>
+            <w:t>${OBJ_HAZARDOUS_SUBSTANCE_SHORT}</w:t>
+          </w:r>
+        </w:sdtContent>
+      </w:sdt>
+      <w:r>
+        <w:t>).</w:t>
       </w:r>
     </w:p>
     <w:p>
@@ -7561,7 +7578,7 @@
           <w:lang w:val="en-US"/>
         </w:rPr>
       </w:pPr>
-      <w:bookmarkStart w:id="38" w:name="_Hlk221785402"/>
+      <w:bookmarkStart w:id="39" w:name="_Hlk221785402"/>
     </w:p>
     <w:p>
       <w:pPr>
@@ -7584,28 +7601,17 @@
           </w:placeholder>
           <w:text/>
         </w:sdtPr>
+        <w:sdtEndPr/>
         <w:sdtContent>
           <w:r>
             <w:rPr>
               <w:lang w:val="en-US"/>
             </w:rPr>
-            <w:t>${</w:t>
-          </w:r>
-          <w:r>
-            <w:rPr>
-              <w:lang w:val="en-US"/>
-            </w:rPr>
-            <w:t>OBJ_LINC_TEXT_3_TABLE</w:t>
-          </w:r>
-          <w:r>
-            <w:rPr>
-              <w:lang w:val="en-US"/>
-            </w:rPr>
-            <w:t>}</w:t>
+            <w:t>${OBJ_LINC_TEXT_3_TABLE}</w:t>
           </w:r>
         </w:sdtContent>
       </w:sdt>
-      <w:bookmarkEnd w:id="38"/>
+      <w:bookmarkEnd w:id="39"/>
       <w:r>
         <w:rPr>
           <w:lang w:val="en-US"/>
@@ -7624,6 +7630,7 @@
           </w:placeholder>
           <w:text/>
         </w:sdtPr>
+        <w:sdtEndPr/>
         <w:sdtContent>
           <w:r>
             <w:rPr>
@@ -7667,7 +7674,7 @@
         </w:rPr>
         <w:t xml:space="preserve"> </w:t>
       </w:r>
-      <w:bookmarkStart w:id="39" w:name="_Hlk221870690"/>
+      <w:bookmarkStart w:id="40" w:name="_Hlk221870690"/>
       <w:sdt>
         <w:sdtPr>
           <w:rPr>
@@ -7680,6 +7687,7 @@
           </w:placeholder>
           <w:text/>
         </w:sdtPr>
+        <w:sdtEndPr/>
         <w:sdtContent>
           <w:r>
             <w:rPr>
@@ -7689,7 +7697,7 @@
           </w:r>
         </w:sdtContent>
       </w:sdt>
-      <w:bookmarkEnd w:id="39"/>
+      <w:bookmarkEnd w:id="40"/>
       <w:r>
         <w:rPr>
           <w:lang w:val="en-US"/>
@@ -7708,24 +7716,13 @@
           </w:placeholder>
           <w:text/>
         </w:sdtPr>
+        <w:sdtEndPr/>
         <w:sdtContent>
           <w:r>
             <w:rPr>
               <w:lang w:val="en-US"/>
             </w:rPr>
-            <w:t>${OBJ_TEXT_NAME_</w:t>
-          </w:r>
-          <w:r>
-            <w:rPr>
-              <w:lang w:val="en-US"/>
-            </w:rPr>
-            <w:t>3</w:t>
-          </w:r>
-          <w:r>
-            <w:rPr>
-              <w:lang w:val="en-US"/>
-            </w:rPr>
-            <w:t>_TABLE}</w:t>
+            <w:t>${OBJ_TEXT_NAME_3_TABLE}</w:t>
           </w:r>
         </w:sdtContent>
       </w:sdt>
@@ -7917,6 +7914,7 @@
           </w:placeholder>
           <w:text/>
         </w:sdtPr>
+        <w:sdtEndPr/>
         <w:sdtContent>
           <w:r>
             <w:rPr>
@@ -7944,6 +7942,7 @@
           </w:placeholder>
           <w:text/>
         </w:sdtPr>
+        <w:sdtEndPr/>
         <w:sdtContent>
           <w:r>
             <w:rPr>
@@ -7999,6 +7998,7 @@
           </w:placeholder>
           <w:text/>
         </w:sdtPr>
+        <w:sdtEndPr/>
         <w:sdtContent>
           <w:r>
             <w:rPr>
@@ -8026,24 +8026,13 @@
           </w:placeholder>
           <w:text/>
         </w:sdtPr>
+        <w:sdtEndPr/>
         <w:sdtContent>
           <w:r>
             <w:rPr>
               <w:lang w:val="en-US"/>
             </w:rPr>
-            <w:t>${OBJ_TEXT_NAME_</w:t>
-          </w:r>
-          <w:r>
-            <w:rPr>
-              <w:lang w:val="en-US"/>
-            </w:rPr>
-            <w:t>4</w:t>
-          </w:r>
-          <w:r>
-            <w:rPr>
-              <w:lang w:val="en-US"/>
-            </w:rPr>
-            <w:t>_TABLE}</w:t>
+            <w:t>${OBJ_TEXT_NAME_4_TABLE}</w:t>
           </w:r>
         </w:sdtContent>
       </w:sdt>
@@ -8184,24 +8173,13 @@
           </w:placeholder>
           <w:text/>
         </w:sdtPr>
+        <w:sdtEndPr/>
         <w:sdtContent>
           <w:r>
             <w:rPr>
               <w:lang w:val="en-US"/>
             </w:rPr>
-            <w:t>${OBJ_LINC_TEXT_</w:t>
-          </w:r>
-          <w:r>
-            <w:rPr>
-              <w:lang w:val="en-US"/>
-            </w:rPr>
-            <w:t>3</w:t>
-          </w:r>
-          <w:r>
-            <w:rPr>
-              <w:lang w:val="en-US"/>
-            </w:rPr>
-            <w:t>_IMAGE}</w:t>
+            <w:t>${OBJ_LINC_TEXT_3_IMAGE}</w:t>
           </w:r>
         </w:sdtContent>
       </w:sdt>
@@ -8223,24 +8201,13 @@
           </w:placeholder>
           <w:text/>
         </w:sdtPr>
+        <w:sdtEndPr/>
         <w:sdtContent>
           <w:r>
             <w:rPr>
               <w:lang w:val="en-US"/>
             </w:rPr>
-            <w:t>${OBJ_NUM_</w:t>
-          </w:r>
-          <w:r>
-            <w:rPr>
-              <w:lang w:val="en-US"/>
-            </w:rPr>
-            <w:t>3</w:t>
-          </w:r>
-          <w:r>
-            <w:rPr>
-              <w:lang w:val="en-US"/>
-            </w:rPr>
-            <w:t>_IMAGE}</w:t>
+            <w:t>${OBJ_NUM_3_IMAGE}</w:t>
           </w:r>
         </w:sdtContent>
       </w:sdt>
@@ -8317,24 +8284,13 @@
           </w:placeholder>
           <w:text/>
         </w:sdtPr>
+        <w:sdtEndPr/>
         <w:sdtContent>
           <w:r>
             <w:rPr>
               <w:lang w:val="en-US"/>
             </w:rPr>
-            <w:t>${OBJ_NUM_</w:t>
-          </w:r>
-          <w:r>
-            <w:rPr>
-              <w:lang w:val="en-US"/>
-            </w:rPr>
-            <w:t>3</w:t>
-          </w:r>
-          <w:r>
-            <w:rPr>
-              <w:lang w:val="en-US"/>
-            </w:rPr>
-            <w:t>_IMAGE}</w:t>
+            <w:t>${OBJ_NUM_3_IMAGE}</w:t>
           </w:r>
         </w:sdtContent>
       </w:sdt>
@@ -8356,24 +8312,13 @@
           </w:placeholder>
           <w:text/>
         </w:sdtPr>
+        <w:sdtEndPr/>
         <w:sdtContent>
           <w:r>
             <w:rPr>
               <w:lang w:val="en-US"/>
             </w:rPr>
-            <w:t>${OBJ_TEXT_CAPTURE_</w:t>
-          </w:r>
-          <w:r>
-            <w:rPr>
-              <w:lang w:val="en-US"/>
-            </w:rPr>
-            <w:t>3</w:t>
-          </w:r>
-          <w:r>
-            <w:rPr>
-              <w:lang w:val="en-US"/>
-            </w:rPr>
-            <w:t>_IMAGE}</w:t>
+            <w:t>${OBJ_TEXT_CAPTURE_3_IMAGE}</w:t>
           </w:r>
         </w:sdtContent>
       </w:sdt>
@@ -8388,23 +8333,23 @@
       <w:pPr>
         <w:pStyle w:val="2a"/>
       </w:pPr>
-      <w:bookmarkStart w:id="40" w:name="_Toc392754515"/>
-      <w:bookmarkStart w:id="41" w:name="_Toc430097611"/>
-      <w:bookmarkStart w:id="42" w:name="_Toc430255938"/>
-      <w:bookmarkStart w:id="43" w:name="_Toc209703492"/>
-      <w:bookmarkStart w:id="44" w:name="_Toc221000965"/>
+      <w:bookmarkStart w:id="41" w:name="_Toc392754515"/>
+      <w:bookmarkStart w:id="42" w:name="_Toc430097611"/>
+      <w:bookmarkStart w:id="43" w:name="_Toc430255938"/>
+      <w:bookmarkStart w:id="44" w:name="_Toc209703492"/>
+      <w:bookmarkStart w:id="45" w:name="_Toc221000965"/>
       <w:r>
         <w:lastRenderedPageBreak/>
         <w:t xml:space="preserve">2.2. </w:t>
       </w:r>
-      <w:bookmarkEnd w:id="40"/>
       <w:bookmarkEnd w:id="41"/>
       <w:bookmarkEnd w:id="42"/>
       <w:bookmarkEnd w:id="43"/>
+      <w:bookmarkEnd w:id="44"/>
       <w:r>
         <w:t>Характеристики аварийности, присущие объекту, и травматизма на нем</w:t>
       </w:r>
-      <w:bookmarkEnd w:id="44"/>
+      <w:bookmarkEnd w:id="45"/>
     </w:p>
     <w:p>
       <w:pPr>
@@ -8412,19 +8357,13 @@
         <w:jc w:val="both"/>
       </w:pPr>
       <w:r>
-        <w:t>Исходя из анализа аварий на объектах с</w:t>
-      </w:r>
-      <w:r>
-        <w:t>ет</w:t>
-      </w:r>
-      <w:r>
-        <w:t>и</w:t>
-      </w:r>
-      <w:r>
-        <w:t xml:space="preserve"> газо</w:t>
-      </w:r>
-      <w:r>
-        <w:t xml:space="preserve">потребления можно выделить следующие причины: </w:t>
+        <w:t>Исходя из анализа аварий на</w:t>
+      </w:r>
+      <w:r>
+        <w:t xml:space="preserve"> аналогичных</w:t>
+      </w:r>
+      <w:r>
+        <w:t xml:space="preserve"> объектах можно выделить следующие причины: </w:t>
       </w:r>
     </w:p>
     <w:p>
@@ -8454,7 +8393,13 @@
         <w:jc w:val="both"/>
       </w:pPr>
       <w:r>
-        <w:t>Повреждения газовых сетей и сооружений, наблюдаемые при повседневной эксплуатации, приводящие к образованию отдельных мест утечки газа, возникают по разным причинам: вследствие коррозии трубопроводов, нарушения плотности соединений в арматуре, в резьбе и фланцах трубопроводов, переломов труб, появления трещин. Особое место занимают аварии на магистральных газопроводах, потому что авария магистрального газопровода может лишить топлива значительное число потребителей, кроме того, такая авария сопровождается пожаром и на ее ликвидацию и восстановление газоснабжения требуется определенное время.</w:t>
+        <w:t xml:space="preserve">Повреждения </w:t>
+      </w:r>
+      <w:r>
+        <w:t>Объектов</w:t>
+      </w:r>
+      <w:r>
+        <w:t xml:space="preserve"> и сооружений, наблюдаемые при повседневной эксплуатации, приводящие к образованию отдельных мест утечки газа, возникают по разным причинам: вследствие коррозии трубопроводов, нарушения плотности соединений в арматуре, в резьбе и фланцах трубопроводов, переломов труб, появления трещин. Особое место занимают аварии на магистральных газопроводах, потому что авария магистрального газопровода может лишить топлива значительное число потребителей, кроме того, такая авария сопровождается пожаром и на ее ликвидацию и восстановление газоснабжения требуется определенное время.</w:t>
       </w:r>
     </w:p>
     <w:p>
@@ -8464,7 +8409,13 @@
         <w:jc w:val="both"/>
       </w:pPr>
       <w:r>
-        <w:t>Практика эксплуатации газовых сетей и сооружений показывает, что при повреждении отдельных элементов системы вытекающий газ может легко воспламениться, после чего начинается его интенсивное горение. То же самое происходит и при повреждении газгольдеров. Газ загорается, но взрывов при этом не бывает. Объясняется это тем, что взрывоопасен не сам газ, а его смесь с воздухом, так называемая газовоздушная смесь, и притом в строго определенной пропорции. Так, пропан взрывается при содержании</w:t>
+        <w:t xml:space="preserve">Практика эксплуатации </w:t>
+      </w:r>
+      <w:r>
+        <w:t>Объектов</w:t>
+      </w:r>
+      <w:r>
+        <w:t xml:space="preserve"> и сооружений показывает, что при повреждении отдельных элементов системы вытекающий газ может легко воспламениться, после чего начинается его интенсивное горение. То же самое происходит и при повреждении газгольдеров. Газ загорается, но взрывов при этом не бывает. Объясняется это тем, что взрывоопасен не сам газ, а его смесь с воздухом, так называемая газовоздушная смесь, и притом в строго определенной пропорции. Так, пропан взрывается при содержании</w:t>
       </w:r>
     </w:p>
     <w:p>
@@ -8556,15 +8507,15 @@
           <w:lang w:eastAsia="en-US"/>
         </w:rPr>
       </w:pPr>
-      <w:bookmarkStart w:id="45" w:name="_Toc405384919"/>
-      <w:bookmarkStart w:id="46" w:name="_Toc405989862"/>
-      <w:bookmarkStart w:id="47" w:name="_Toc409789862"/>
-      <w:bookmarkStart w:id="48" w:name="_Toc409790164"/>
-      <w:bookmarkStart w:id="49" w:name="_Toc427057243"/>
-      <w:bookmarkStart w:id="50" w:name="_Toc430943228"/>
-      <w:bookmarkStart w:id="51" w:name="_Toc430958121"/>
-      <w:bookmarkStart w:id="52" w:name="_Toc209703493"/>
-      <w:bookmarkStart w:id="53" w:name="_Toc221000966"/>
+      <w:bookmarkStart w:id="46" w:name="_Toc405384919"/>
+      <w:bookmarkStart w:id="47" w:name="_Toc405989862"/>
+      <w:bookmarkStart w:id="48" w:name="_Toc409789862"/>
+      <w:bookmarkStart w:id="49" w:name="_Toc409790164"/>
+      <w:bookmarkStart w:id="50" w:name="_Toc427057243"/>
+      <w:bookmarkStart w:id="51" w:name="_Toc430943228"/>
+      <w:bookmarkStart w:id="52" w:name="_Toc430958121"/>
+      <w:bookmarkStart w:id="53" w:name="_Toc209703493"/>
+      <w:bookmarkStart w:id="54" w:name="_Toc221000966"/>
       <w:r>
         <w:rPr>
           <w:lang w:eastAsia="en-US"/>
@@ -8626,7 +8577,6 @@
         </w:rPr>
         <w:t>соответствие задачам ликвидации последствий аварий</w:t>
       </w:r>
-      <w:bookmarkEnd w:id="45"/>
       <w:bookmarkEnd w:id="46"/>
       <w:bookmarkEnd w:id="47"/>
       <w:bookmarkEnd w:id="48"/>
@@ -8635,6 +8585,7 @@
       <w:bookmarkEnd w:id="51"/>
       <w:bookmarkEnd w:id="52"/>
       <w:bookmarkEnd w:id="53"/>
+      <w:bookmarkEnd w:id="54"/>
     </w:p>
     <w:p>
       <w:pPr>
@@ -8666,6 +8617,7 @@
           </w:placeholder>
           <w:text/>
         </w:sdtPr>
+        <w:sdtEndPr/>
         <w:sdtContent>
           <w:r>
             <w:t>${ASF_STATUS_SHORT}</w:t>
@@ -8687,6 +8639,7 @@
           </w:placeholder>
           <w:text/>
         </w:sdtPr>
+        <w:sdtEndPr/>
         <w:sdtContent>
           <w:r>
             <w:t>${ASF_FULL_NAME_GEN}</w:t>
@@ -8705,6 +8658,7 @@
           </w:placeholder>
           <w:text/>
         </w:sdtPr>
+        <w:sdtEndPr/>
         <w:sdtContent>
           <w:r>
             <w:t>${ASF_SHORT_NAME}</w:t>
@@ -8733,6 +8687,7 @@
           </w:placeholder>
           <w:text/>
         </w:sdtPr>
+        <w:sdtEndPr/>
         <w:sdtContent>
           <w:r>
             <w:rPr>
@@ -8778,6 +8733,7 @@
           </w:placeholder>
           <w:text/>
         </w:sdtPr>
+        <w:sdtEndPr/>
         <w:sdtContent>
           <w:r>
             <w:rPr>
@@ -8805,6 +8761,7 @@
           </w:placeholder>
           <w:text/>
         </w:sdtPr>
+        <w:sdtEndPr/>
         <w:sdtContent>
           <w:r>
             <w:t>${ASF_CERTIFICATE_TEXT}</w:t>
@@ -8833,6 +8790,7 @@
           </w:placeholder>
           <w:text/>
         </w:sdtPr>
+        <w:sdtEndPr/>
         <w:sdtContent>
           <w:r>
             <w:t>${ASF_WORK_TYPES}</w:t>
@@ -8867,7 +8825,7 @@
       <w:r>
         <w:t xml:space="preserve"> </w:t>
       </w:r>
-      <w:bookmarkStart w:id="54" w:name="_Hlk221181409"/>
+      <w:bookmarkStart w:id="55" w:name="_Hlk221181409"/>
       <w:sdt>
         <w:sdtPr>
           <w:tag w:val="ORG_SHORT_NAME"/>
@@ -8877,13 +8835,14 @@
           </w:placeholder>
           <w:text/>
         </w:sdtPr>
+        <w:sdtEndPr/>
         <w:sdtContent>
           <w:r>
             <w:t>${ORG_SHORT_NAME}</w:t>
           </w:r>
         </w:sdtContent>
       </w:sdt>
-      <w:bookmarkEnd w:id="54"/>
+      <w:bookmarkEnd w:id="55"/>
       <w:r>
         <w:t xml:space="preserve"> и </w:t>
       </w:r>
@@ -8896,6 +8855,7 @@
           </w:placeholder>
           <w:text/>
         </w:sdtPr>
+        <w:sdtEndPr/>
         <w:sdtContent>
           <w:r>
             <w:t>${ASF_SHORT_NAME}</w:t>
@@ -8938,6 +8898,7 @@
           </w:placeholder>
           <w:text/>
         </w:sdtPr>
+        <w:sdtEndPr/>
         <w:sdtContent>
           <w:r>
             <w:rPr>
@@ -9040,24 +9001,23 @@
       <w:pPr>
         <w:pStyle w:val="2a"/>
       </w:pPr>
-      <w:bookmarkStart w:id="55" w:name="_Toc430943229"/>
-      <w:bookmarkStart w:id="56" w:name="_Toc430958122"/>
-      <w:bookmarkStart w:id="57" w:name="_Toc209703494"/>
-      <w:bookmarkStart w:id="58" w:name="_Toc221000967"/>
+      <w:bookmarkStart w:id="56" w:name="_Toc430943229"/>
+      <w:bookmarkStart w:id="57" w:name="_Toc430958122"/>
+      <w:bookmarkStart w:id="58" w:name="_Toc209703494"/>
+      <w:bookmarkStart w:id="59" w:name="_Toc221000967"/>
       <w:r>
         <w:t>4.</w:t>
       </w:r>
       <w:r>
         <w:t xml:space="preserve"> </w:t>
       </w:r>
-      <w:bookmarkStart w:id="59" w:name="_Toc379906092"/>
-      <w:bookmarkStart w:id="60" w:name="_Toc381802538"/>
-      <w:bookmarkStart w:id="61" w:name="_Toc391383486"/>
-      <w:bookmarkStart w:id="62" w:name="_Toc414977738"/>
+      <w:bookmarkStart w:id="60" w:name="_Toc379906092"/>
+      <w:bookmarkStart w:id="61" w:name="_Toc381802538"/>
+      <w:bookmarkStart w:id="62" w:name="_Toc391383486"/>
+      <w:bookmarkStart w:id="63" w:name="_Toc414977738"/>
       <w:r>
         <w:t>Организация взаимодействия сил и средств</w:t>
       </w:r>
-      <w:bookmarkEnd w:id="55"/>
       <w:bookmarkEnd w:id="56"/>
       <w:bookmarkEnd w:id="57"/>
       <w:bookmarkEnd w:id="58"/>
@@ -9065,6 +9025,7 @@
       <w:bookmarkEnd w:id="60"/>
       <w:bookmarkEnd w:id="61"/>
       <w:bookmarkEnd w:id="62"/>
+      <w:bookmarkEnd w:id="63"/>
     </w:p>
     <w:p>
       <w:pPr>
@@ -9197,6 +9158,7 @@
           </w:placeholder>
           <w:text/>
         </w:sdtPr>
+        <w:sdtEndPr/>
         <w:sdtContent>
           <w:r>
             <w:t>${ORG_SHORT_NAME}</w:t>
@@ -9228,6 +9190,7 @@
           </w:placeholder>
           <w:text/>
         </w:sdtPr>
+        <w:sdtEndPr/>
         <w:sdtContent>
           <w:r>
             <w:rPr>
@@ -9255,6 +9218,7 @@
           </w:placeholder>
           <w:text/>
         </w:sdtPr>
+        <w:sdtEndPr/>
         <w:sdtContent>
           <w:r>
             <w:rPr>
@@ -9285,10 +9249,10 @@
       <w:pPr>
         <w:pStyle w:val="2a"/>
       </w:pPr>
-      <w:bookmarkStart w:id="63" w:name="_Toc430943230"/>
-      <w:bookmarkStart w:id="64" w:name="_Toc430958123"/>
-      <w:bookmarkStart w:id="65" w:name="_Toc209703495"/>
-      <w:bookmarkStart w:id="66" w:name="_Toc221000968"/>
+      <w:bookmarkStart w:id="64" w:name="_Toc430943230"/>
+      <w:bookmarkStart w:id="65" w:name="_Toc430958123"/>
+      <w:bookmarkStart w:id="66" w:name="_Toc209703495"/>
+      <w:bookmarkStart w:id="67" w:name="_Toc221000968"/>
       <w:r>
         <w:lastRenderedPageBreak/>
         <w:t>5</w:t>
@@ -9296,10 +9260,10 @@
       <w:r>
         <w:t>. Состав и дислокация сил и средств</w:t>
       </w:r>
-      <w:bookmarkEnd w:id="63"/>
       <w:bookmarkEnd w:id="64"/>
       <w:bookmarkEnd w:id="65"/>
       <w:bookmarkEnd w:id="66"/>
+      <w:bookmarkEnd w:id="67"/>
     </w:p>
     <w:p>
       <w:pPr>
@@ -9342,6 +9306,7 @@
           </w:placeholder>
           <w:text/>
         </w:sdtPr>
+        <w:sdtEndPr/>
         <w:sdtContent>
           <w:r>
             <w:t>${ORG_SHORT_NAME}</w:t>
@@ -9393,36 +9358,13 @@
           </w:placeholder>
           <w:text/>
         </w:sdtPr>
+        <w:sdtEndPr/>
         <w:sdtContent>
           <w:r>
             <w:rPr>
               <w:lang w:val="en-US"/>
             </w:rPr>
-            <w:t>${</w:t>
-          </w:r>
-          <w:r>
-            <w:rPr>
-              <w:lang w:val="en-US"/>
-            </w:rPr>
-            <w:t>OBJ_LINC_TEXT_</w:t>
-          </w:r>
-          <w:r>
-            <w:rPr>
-              <w:lang w:val="en-US"/>
-            </w:rPr>
-            <w:t>5</w:t>
-          </w:r>
-          <w:r>
-            <w:rPr>
-              <w:lang w:val="en-US"/>
-            </w:rPr>
-            <w:t>_TABLE</w:t>
-          </w:r>
-          <w:r>
-            <w:rPr>
-              <w:lang w:val="en-US"/>
-            </w:rPr>
-            <w:t>}</w:t>
+            <w:t>${OBJ_LINC_TEXT_5_TABLE}</w:t>
           </w:r>
         </w:sdtContent>
       </w:sdt>
@@ -9444,6 +9386,7 @@
           </w:placeholder>
           <w:text/>
         </w:sdtPr>
+        <w:sdtEndPr/>
         <w:sdtContent>
           <w:r>
             <w:rPr>
@@ -9497,6 +9440,7 @@
           </w:placeholder>
           <w:text/>
         </w:sdtPr>
+        <w:sdtEndPr/>
         <w:sdtContent>
           <w:r>
             <w:rPr>
@@ -9524,24 +9468,13 @@
           </w:placeholder>
           <w:text/>
         </w:sdtPr>
+        <w:sdtEndPr/>
         <w:sdtContent>
           <w:r>
             <w:rPr>
               <w:lang w:val="en-US"/>
             </w:rPr>
-            <w:t>${OBJ_TEXT_NAME_</w:t>
-          </w:r>
-          <w:r>
-            <w:rPr>
-              <w:lang w:val="en-US"/>
-            </w:rPr>
-            <w:t>5</w:t>
-          </w:r>
-          <w:r>
-            <w:rPr>
-              <w:lang w:val="en-US"/>
-            </w:rPr>
-            <w:t>_TABLE}</w:t>
+            <w:t>${OBJ_TEXT_NAME_5_TABLE}</w:t>
           </w:r>
         </w:sdtContent>
       </w:sdt>
@@ -9784,7 +9717,7 @@
         </w:rPr>
         <w:t>Привлекаемые силы и средства:</w:t>
       </w:r>
-      <w:bookmarkStart w:id="67" w:name="_Hlk221181612"/>
+      <w:bookmarkStart w:id="68" w:name="_Hlk221181612"/>
       <w:r>
         <w:t xml:space="preserve"> </w:t>
       </w:r>
@@ -9797,13 +9730,14 @@
           </w:placeholder>
           <w:text/>
         </w:sdtPr>
+        <w:sdtEndPr/>
         <w:sdtContent>
           <w:r>
             <w:t>${ASF_STATUS_SHORT}</w:t>
           </w:r>
         </w:sdtContent>
       </w:sdt>
-      <w:bookmarkEnd w:id="67"/>
+      <w:bookmarkEnd w:id="68"/>
       <w:r>
         <w:t xml:space="preserve"> –</w:t>
       </w:r>
@@ -9819,6 +9753,7 @@
           </w:placeholder>
           <w:text/>
         </w:sdtPr>
+        <w:sdtEndPr/>
         <w:sdtContent>
           <w:r>
             <w:t>${ASF_SHORT_NAME}</w:t>
@@ -9871,6 +9806,7 @@
           </w:placeholder>
           <w:text/>
         </w:sdtPr>
+        <w:sdtEndPr/>
         <w:sdtContent>
           <w:r>
             <w:t>${ASF_AREA_RESPONSIBILITY}</w:t>
@@ -9931,6 +9867,7 @@
           </w:placeholder>
           <w:text/>
         </w:sdtPr>
+        <w:sdtEndPr/>
         <w:sdtContent>
           <w:r>
             <w:rPr>
@@ -9985,6 +9922,7 @@
           </w:placeholder>
           <w:text/>
         </w:sdtPr>
+        <w:sdtEndPr/>
         <w:sdtContent>
           <w:r>
             <w:rPr>
@@ -10064,6 +10002,7 @@
           </w:placeholder>
           <w:text/>
         </w:sdtPr>
+        <w:sdtEndPr/>
         <w:sdtContent>
           <w:r>
             <w:rPr>
@@ -10124,6 +10063,7 @@
           </w:placeholder>
           <w:text/>
         </w:sdtPr>
+        <w:sdtEndPr/>
         <w:sdtContent>
           <w:r>
             <w:rPr>
@@ -10213,6 +10153,7 @@
           </w:placeholder>
           <w:text/>
         </w:sdtPr>
+        <w:sdtEndPr/>
         <w:sdtContent>
           <w:r>
             <w:rPr>
@@ -10276,6 +10217,7 @@
           </w:placeholder>
           <w:text/>
         </w:sdtPr>
+        <w:sdtEndPr/>
         <w:sdtContent>
           <w:r>
             <w:rPr>
@@ -10395,6 +10337,7 @@
           </w:placeholder>
           <w:text/>
         </w:sdtPr>
+        <w:sdtEndPr/>
         <w:sdtContent>
           <w:r>
             <w:rPr>
@@ -10402,23 +10345,7 @@
               <w:u w:val="single"/>
               <w:lang w:val="en-US"/>
             </w:rPr>
-            <w:t>${</w:t>
-          </w:r>
-          <w:r>
-            <w:rPr>
-              <w:szCs w:val="24"/>
-              <w:u w:val="single"/>
-              <w:lang w:val="en-US"/>
-            </w:rPr>
-            <w:t>ASF_</w:t>
-          </w:r>
-          <w:r>
-            <w:rPr>
-              <w:szCs w:val="24"/>
-              <w:u w:val="single"/>
-              <w:lang w:val="en-US"/>
-            </w:rPr>
-            <w:t>NUMBER_PERSONNEL_STAFF}</w:t>
+            <w:t>${ASF_NUMBER_PERSONNEL_STAFF}</w:t>
           </w:r>
         </w:sdtContent>
       </w:sdt>
@@ -10474,6 +10401,7 @@
           </w:placeholder>
           <w:text/>
         </w:sdtPr>
+        <w:sdtEndPr/>
         <w:sdtContent>
           <w:r>
             <w:rPr>
@@ -10481,23 +10409,7 @@
               <w:u w:val="single"/>
               <w:lang w:val="en-US"/>
             </w:rPr>
-            <w:t>${</w:t>
-          </w:r>
-          <w:r>
-            <w:rPr>
-              <w:szCs w:val="24"/>
-              <w:u w:val="single"/>
-              <w:lang w:val="en-US"/>
-            </w:rPr>
-            <w:t>ASF_</w:t>
-          </w:r>
-          <w:r>
-            <w:rPr>
-              <w:szCs w:val="24"/>
-              <w:u w:val="single"/>
-              <w:lang w:val="en-US"/>
-            </w:rPr>
-            <w:t>NUMBER_PERSONNEL_LIST}</w:t>
+            <w:t>${ASF_NUMBER_PERSONNEL_LIST}</w:t>
           </w:r>
         </w:sdtContent>
       </w:sdt>
@@ -10516,6 +10428,7 @@
         </w:placeholder>
         <w:text/>
       </w:sdtPr>
+      <w:sdtEndPr/>
       <w:sdtContent>
         <w:p>
           <w:pPr>
@@ -10590,6 +10503,7 @@
           </w:placeholder>
           <w:text/>
         </w:sdtPr>
+        <w:sdtEndPr/>
         <w:sdtContent>
           <w:r>
             <w:rPr>
@@ -10626,7 +10540,7 @@
       <w:r>
         <w:t xml:space="preserve"> </w:t>
       </w:r>
-      <w:bookmarkStart w:id="68" w:name="_Hlk221181717"/>
+      <w:bookmarkStart w:id="69" w:name="_Hlk221181717"/>
       <w:sdt>
         <w:sdtPr>
           <w:tag w:val="ASF_STATUS"/>
@@ -10636,6 +10550,7 @@
           </w:placeholder>
           <w:text/>
         </w:sdtPr>
+        <w:sdtEndPr/>
         <w:sdtContent>
           <w:r>
             <w:t>${ASF_STATUS_SHORT}</w:t>
@@ -10657,6 +10572,7 @@
           </w:placeholder>
           <w:text/>
         </w:sdtPr>
+        <w:sdtEndPr/>
         <w:sdtContent>
           <w:r>
             <w:t>${ASF_SHORT_NAME}</w:t>
@@ -10666,7 +10582,7 @@
       <w:r>
         <w:t xml:space="preserve"> </w:t>
       </w:r>
-      <w:bookmarkEnd w:id="68"/>
+      <w:bookmarkEnd w:id="69"/>
       <w:r>
         <w:t>приведены в Приложении 2.</w:t>
       </w:r>
@@ -10684,10 +10600,10 @@
           <w:lang w:eastAsia="en-US"/>
         </w:rPr>
       </w:pPr>
-      <w:bookmarkStart w:id="69" w:name="_Toc430943233"/>
-      <w:bookmarkStart w:id="70" w:name="_Toc430958125"/>
-      <w:bookmarkStart w:id="71" w:name="_Toc209703496"/>
-      <w:bookmarkStart w:id="72" w:name="_Toc221000969"/>
+      <w:bookmarkStart w:id="70" w:name="_Toc430943233"/>
+      <w:bookmarkStart w:id="71" w:name="_Toc430958125"/>
+      <w:bookmarkStart w:id="72" w:name="_Toc209703496"/>
+      <w:bookmarkStart w:id="73" w:name="_Toc221000969"/>
       <w:r>
         <w:rPr>
           <w:lang w:eastAsia="en-US"/>
@@ -10700,8 +10616,8 @@
         </w:rPr>
         <w:t xml:space="preserve">. Порядок обеспечения постоянной готовности сил и средств к локализации и ликвидации последствий аварий на </w:t>
       </w:r>
-      <w:bookmarkEnd w:id="69"/>
       <w:bookmarkEnd w:id="70"/>
+      <w:bookmarkEnd w:id="71"/>
       <w:r>
         <w:rPr>
           <w:lang w:eastAsia="en-US"/>
@@ -10714,8 +10630,8 @@
         </w:rPr>
         <w:t>, которые несут ответственность за поддержание этих сил и средств в надлежащей степени готовности</w:t>
       </w:r>
-      <w:bookmarkEnd w:id="71"/>
       <w:bookmarkEnd w:id="72"/>
+      <w:bookmarkEnd w:id="73"/>
     </w:p>
     <w:p>
       <w:pPr>
@@ -10738,6 +10654,7 @@
           </w:placeholder>
           <w:text/>
         </w:sdtPr>
+        <w:sdtEndPr/>
         <w:sdtContent>
           <w:r>
             <w:t>${ASF_STATUS_SHORT}</w:t>
@@ -10759,6 +10676,7 @@
           </w:placeholder>
           <w:text/>
         </w:sdtPr>
+        <w:sdtEndPr/>
         <w:sdtContent>
           <w:r>
             <w:t>${ASF_SHORT_NAME}</w:t>
@@ -10905,7 +10823,7 @@
       <w:r>
         <w:t xml:space="preserve"> </w:t>
       </w:r>
-      <w:bookmarkStart w:id="73" w:name="_Hlk221197015"/>
+      <w:bookmarkStart w:id="74" w:name="_Hlk221197015"/>
       <w:sdt>
         <w:sdtPr>
           <w:tag w:val="ASF_STATUS_SHORT"/>
@@ -10915,13 +10833,14 @@
           </w:placeholder>
           <w:text/>
         </w:sdtPr>
+        <w:sdtEndPr/>
         <w:sdtContent>
           <w:r>
             <w:t>${ASF_STATUS_SHORT}</w:t>
           </w:r>
         </w:sdtContent>
       </w:sdt>
-      <w:bookmarkEnd w:id="73"/>
+      <w:bookmarkEnd w:id="74"/>
       <w:r>
         <w:t xml:space="preserve"> </w:t>
       </w:r>
@@ -10937,6 +10856,7 @@
           </w:placeholder>
           <w:text/>
         </w:sdtPr>
+        <w:sdtEndPr/>
         <w:sdtContent>
           <w:r>
             <w:t>${ASF_SHORT_NAME}</w:t>
@@ -11035,23 +10955,23 @@
           <w:i/>
         </w:rPr>
       </w:pPr>
-      <w:bookmarkStart w:id="74" w:name="_Toc430943234"/>
-      <w:bookmarkStart w:id="75" w:name="_Toc430958126"/>
-      <w:bookmarkStart w:id="76" w:name="_Toc209703497"/>
-      <w:bookmarkStart w:id="77" w:name="_Toc221000970"/>
+      <w:bookmarkStart w:id="75" w:name="_Toc430943234"/>
+      <w:bookmarkStart w:id="76" w:name="_Toc430958126"/>
+      <w:bookmarkStart w:id="77" w:name="_Toc209703497"/>
+      <w:bookmarkStart w:id="78" w:name="_Toc221000970"/>
       <w:r>
         <w:t>7</w:t>
       </w:r>
       <w:r>
         <w:t xml:space="preserve">. Организация управления, связи и оповещения при аварии на </w:t>
       </w:r>
-      <w:bookmarkEnd w:id="74"/>
       <w:bookmarkEnd w:id="75"/>
       <w:bookmarkEnd w:id="76"/>
+      <w:bookmarkEnd w:id="77"/>
       <w:r>
         <w:t>объекте</w:t>
       </w:r>
-      <w:bookmarkEnd w:id="77"/>
+      <w:bookmarkEnd w:id="78"/>
     </w:p>
     <w:p>
       <w:pPr>
@@ -11071,6 +10991,7 @@
           </w:placeholder>
           <w:text/>
         </w:sdtPr>
+        <w:sdtEndPr/>
         <w:sdtContent>
           <w:r>
             <w:t>${ORG_SHORT_NAME}</w:t>
@@ -11145,6 +11066,7 @@
           </w:placeholder>
           <w:text/>
         </w:sdtPr>
+        <w:sdtEndPr/>
         <w:sdtContent>
           <w:r>
             <w:t>${ORG_SHORT_NAME}</w:t>
@@ -11256,6 +11178,7 @@
           </w:placeholder>
           <w:text/>
         </w:sdtPr>
+        <w:sdtEndPr/>
         <w:sdtContent>
           <w:r>
             <w:rPr>
@@ -11283,6 +11206,7 @@
           </w:placeholder>
           <w:text/>
         </w:sdtPr>
+        <w:sdtEndPr/>
         <w:sdtContent>
           <w:r>
             <w:rPr>
@@ -11330,6 +11254,7 @@
           </w:placeholder>
           <w:text/>
         </w:sdtPr>
+        <w:sdtEndPr/>
         <w:sdtContent>
           <w:r>
             <w:rPr>
@@ -11357,6 +11282,7 @@
           </w:placeholder>
           <w:text/>
         </w:sdtPr>
+        <w:sdtEndPr/>
         <w:sdtContent>
           <w:r>
             <w:rPr>
@@ -11394,36 +11320,13 @@
           </w:placeholder>
           <w:text/>
         </w:sdtPr>
+        <w:sdtEndPr/>
         <w:sdtContent>
           <w:r>
             <w:rPr>
               <w:lang w:val="en-US"/>
             </w:rPr>
-            <w:t>${</w:t>
-          </w:r>
-          <w:r>
-            <w:rPr>
-              <w:lang w:val="en-US"/>
-            </w:rPr>
-            <w:t>OBJ_LINC_TEXT_</w:t>
-          </w:r>
-          <w:r>
-            <w:rPr>
-              <w:lang w:val="en-US"/>
-            </w:rPr>
-            <w:t>7</w:t>
-          </w:r>
-          <w:r>
-            <w:rPr>
-              <w:lang w:val="en-US"/>
-            </w:rPr>
-            <w:t>_TABLE</w:t>
-          </w:r>
-          <w:r>
-            <w:rPr>
-              <w:lang w:val="en-US"/>
-            </w:rPr>
-            <w:t>}</w:t>
+            <w:t>${OBJ_LINC_TEXT_7_TABLE}</w:t>
           </w:r>
         </w:sdtContent>
       </w:sdt>
@@ -11445,24 +11348,13 @@
           </w:placeholder>
           <w:text/>
         </w:sdtPr>
+        <w:sdtEndPr/>
         <w:sdtContent>
           <w:r>
             <w:rPr>
               <w:lang w:val="en-US"/>
             </w:rPr>
-            <w:t>${OBJ_NUM_</w:t>
-          </w:r>
-          <w:r>
-            <w:rPr>
-              <w:lang w:val="en-US"/>
-            </w:rPr>
-            <w:t>7</w:t>
-          </w:r>
-          <w:r>
-            <w:rPr>
-              <w:lang w:val="en-US"/>
-            </w:rPr>
-            <w:t>_TABLE}</w:t>
+            <w:t>${OBJ_NUM_7_TABLE}</w:t>
           </w:r>
         </w:sdtContent>
       </w:sdt>
@@ -11495,36 +11387,13 @@
           </w:placeholder>
           <w:text/>
         </w:sdtPr>
+        <w:sdtEndPr/>
         <w:sdtContent>
           <w:r>
             <w:rPr>
               <w:lang w:val="en-US"/>
             </w:rPr>
-            <w:t>${</w:t>
-          </w:r>
-          <w:r>
-            <w:rPr>
-              <w:lang w:val="en-US"/>
-            </w:rPr>
-            <w:t>OBJ_LINC_TEXT_</w:t>
-          </w:r>
-          <w:r>
-            <w:rPr>
-              <w:lang w:val="en-US"/>
-            </w:rPr>
-            <w:t>8</w:t>
-          </w:r>
-          <w:r>
-            <w:rPr>
-              <w:lang w:val="en-US"/>
-            </w:rPr>
-            <w:t>_TABLE</w:t>
-          </w:r>
-          <w:r>
-            <w:rPr>
-              <w:lang w:val="en-US"/>
-            </w:rPr>
-            <w:t>}</w:t>
+            <w:t>${OBJ_LINC_TEXT_8_TABLE}</w:t>
           </w:r>
         </w:sdtContent>
       </w:sdt>
@@ -11546,24 +11415,13 @@
           </w:placeholder>
           <w:text/>
         </w:sdtPr>
+        <w:sdtEndPr/>
         <w:sdtContent>
           <w:r>
             <w:rPr>
               <w:lang w:val="en-US"/>
             </w:rPr>
-            <w:t>${OBJ_NUM_</w:t>
-          </w:r>
-          <w:r>
-            <w:rPr>
-              <w:lang w:val="en-US"/>
-            </w:rPr>
-            <w:t>8</w:t>
-          </w:r>
-          <w:r>
-            <w:rPr>
-              <w:lang w:val="en-US"/>
-            </w:rPr>
-            <w:t>_TABLE}</w:t>
+            <w:t>${OBJ_NUM_8_TABLE}</w:t>
           </w:r>
         </w:sdtContent>
       </w:sdt>
@@ -11595,6 +11453,7 @@
           </w:placeholder>
           <w:text/>
         </w:sdtPr>
+        <w:sdtEndPr/>
         <w:sdtContent>
           <w:r>
             <w:rPr>
@@ -11622,6 +11481,7 @@
           </w:placeholder>
           <w:text/>
         </w:sdtPr>
+        <w:sdtEndPr/>
         <w:sdtContent>
           <w:r>
             <w:rPr>
@@ -11676,6 +11536,7 @@
           </w:placeholder>
           <w:text/>
         </w:sdtPr>
+        <w:sdtEndPr/>
         <w:sdtContent>
           <w:r>
             <w:rPr>
@@ -11703,24 +11564,13 @@
           </w:placeholder>
           <w:text/>
         </w:sdtPr>
+        <w:sdtEndPr/>
         <w:sdtContent>
           <w:r>
             <w:rPr>
               <w:lang w:val="en-US"/>
             </w:rPr>
-            <w:t>${OBJ_TEXT_NAME_</w:t>
-          </w:r>
-          <w:r>
-            <w:rPr>
-              <w:lang w:val="en-US"/>
-            </w:rPr>
-            <w:t>6</w:t>
-          </w:r>
-          <w:r>
-            <w:rPr>
-              <w:lang w:val="en-US"/>
-            </w:rPr>
-            <w:t>_TABLE}</w:t>
+            <w:t>${OBJ_TEXT_NAME_6_TABLE}</w:t>
           </w:r>
         </w:sdtContent>
       </w:sdt>
@@ -11969,6 +11819,7 @@
           </w:placeholder>
           <w:text/>
         </w:sdtPr>
+        <w:sdtEndPr/>
         <w:sdtContent>
           <w:r>
             <w:rPr>
@@ -11996,24 +11847,13 @@
           </w:placeholder>
           <w:text/>
         </w:sdtPr>
+        <w:sdtEndPr/>
         <w:sdtContent>
           <w:r>
             <w:rPr>
               <w:lang w:val="en-US"/>
             </w:rPr>
-            <w:t>${OBJ_TEXT_NAME_</w:t>
-          </w:r>
-          <w:r>
-            <w:rPr>
-              <w:lang w:val="en-US"/>
-            </w:rPr>
-            <w:t>7</w:t>
-          </w:r>
-          <w:r>
-            <w:rPr>
-              <w:lang w:val="en-US"/>
-            </w:rPr>
-            <w:t>_TABLE}</w:t>
+            <w:t>${OBJ_TEXT_NAME_7_TABLE}</w:t>
           </w:r>
         </w:sdtContent>
       </w:sdt>
@@ -12202,6 +12042,7 @@
           </w:placeholder>
           <w:text/>
         </w:sdtPr>
+        <w:sdtEndPr/>
         <w:sdtContent>
           <w:r>
             <w:rPr>
@@ -12235,24 +12076,13 @@
           </w:placeholder>
           <w:text/>
         </w:sdtPr>
+        <w:sdtEndPr/>
         <w:sdtContent>
           <w:r>
             <w:rPr>
               <w:lang w:val="en-US"/>
             </w:rPr>
-            <w:t>${OBJ_TEXT_NAME_</w:t>
-          </w:r>
-          <w:r>
-            <w:rPr>
-              <w:lang w:val="en-US"/>
-            </w:rPr>
-            <w:t>8</w:t>
-          </w:r>
-          <w:r>
-            <w:rPr>
-              <w:lang w:val="en-US"/>
-            </w:rPr>
-            <w:t>_TABLE}</w:t>
+            <w:t>${OBJ_TEXT_NAME_8_TABLE}</w:t>
           </w:r>
         </w:sdtContent>
       </w:sdt>
@@ -12562,6 +12392,9 @@
       </w:r>
       <w:sdt>
         <w:sdtPr>
+          <w:rPr>
+            <w:lang w:val="en-US"/>
+          </w:rPr>
           <w:tag w:val="OBJ_NUM_4_IMAGE"/>
           <w:id w:val="291799473"/>
           <w:placeholder>
@@ -12569,17 +12402,27 @@
           </w:placeholder>
           <w:text/>
         </w:sdtPr>
+        <w:sdtEndPr/>
         <w:sdtContent>
           <w:r>
+            <w:rPr>
+              <w:lang w:val="en-US"/>
+            </w:rPr>
             <w:t>${OBJ_NUM_4_IMAGE}</w:t>
           </w:r>
         </w:sdtContent>
       </w:sdt>
       <w:r>
+        <w:rPr>
+          <w:lang w:val="en-US"/>
+        </w:rPr>
         <w:t xml:space="preserve"> – </w:t>
       </w:r>
       <w:sdt>
         <w:sdtPr>
+          <w:rPr>
+            <w:lang w:val="en-US"/>
+          </w:rPr>
           <w:tag w:val="OBJ_TEXT_CAPTURE_4_IMAGE"/>
           <w:id w:val="-819424790"/>
           <w:placeholder>
@@ -12587,13 +12430,20 @@
           </w:placeholder>
           <w:text/>
         </w:sdtPr>
+        <w:sdtEndPr/>
         <w:sdtContent>
           <w:r>
+            <w:rPr>
+              <w:lang w:val="en-US"/>
+            </w:rPr>
             <w:t>${OBJ_TEXT_CAPTURE_4_IMAGE}</w:t>
           </w:r>
         </w:sdtContent>
       </w:sdt>
       <w:r>
+        <w:rPr>
+          <w:lang w:val="en-US"/>
+        </w:rPr>
         <w:t>.</w:t>
       </w:r>
     </w:p>
@@ -12604,11 +12454,11 @@
           <w:lang w:eastAsia="en-US"/>
         </w:rPr>
       </w:pPr>
-      <w:bookmarkStart w:id="78" w:name="_Toc427057250"/>
-      <w:bookmarkStart w:id="79" w:name="_Toc430943235"/>
-      <w:bookmarkStart w:id="80" w:name="_Toc430958127"/>
-      <w:bookmarkStart w:id="81" w:name="_Toc209703498"/>
-      <w:bookmarkStart w:id="82" w:name="_Toc221000971"/>
+      <w:bookmarkStart w:id="79" w:name="_Toc427057250"/>
+      <w:bookmarkStart w:id="80" w:name="_Toc430943235"/>
+      <w:bookmarkStart w:id="81" w:name="_Toc430958127"/>
+      <w:bookmarkStart w:id="82" w:name="_Toc209703498"/>
+      <w:bookmarkStart w:id="83" w:name="_Toc221000971"/>
       <w:r>
         <w:rPr>
           <w:lang w:eastAsia="en-US"/>
@@ -12622,11 +12472,11 @@
         </w:rPr>
         <w:t>. Система взаимного обмена информацией между организациями – участниками локализации и ликвидации последствий аварий на объекте</w:t>
       </w:r>
-      <w:bookmarkEnd w:id="78"/>
       <w:bookmarkEnd w:id="79"/>
       <w:bookmarkEnd w:id="80"/>
       <w:bookmarkEnd w:id="81"/>
       <w:bookmarkEnd w:id="82"/>
+      <w:bookmarkEnd w:id="83"/>
     </w:p>
     <w:p>
       <w:pPr>
@@ -12697,12 +12547,12 @@
           <w:lang w:eastAsia="en-US"/>
         </w:rPr>
       </w:pPr>
-      <w:bookmarkStart w:id="83" w:name="_Toc394928129"/>
-      <w:bookmarkStart w:id="84" w:name="_Toc427057251"/>
-      <w:bookmarkStart w:id="85" w:name="_Toc430943236"/>
-      <w:bookmarkStart w:id="86" w:name="_Toc430958128"/>
-      <w:bookmarkStart w:id="87" w:name="_Toc209703499"/>
-      <w:bookmarkStart w:id="88" w:name="_Toc221000972"/>
+      <w:bookmarkStart w:id="84" w:name="_Toc394928129"/>
+      <w:bookmarkStart w:id="85" w:name="_Toc427057251"/>
+      <w:bookmarkStart w:id="86" w:name="_Toc430943236"/>
+      <w:bookmarkStart w:id="87" w:name="_Toc430958128"/>
+      <w:bookmarkStart w:id="88" w:name="_Toc209703499"/>
+      <w:bookmarkStart w:id="89" w:name="_Toc221000972"/>
       <w:r>
         <w:rPr>
           <w:lang w:eastAsia="en-US"/>
@@ -12715,12 +12565,12 @@
         </w:rPr>
         <w:t>. Первоочередные действия при получении сигнала об аварии на объекте</w:t>
       </w:r>
-      <w:bookmarkEnd w:id="83"/>
       <w:bookmarkEnd w:id="84"/>
       <w:bookmarkEnd w:id="85"/>
       <w:bookmarkEnd w:id="86"/>
       <w:bookmarkEnd w:id="87"/>
       <w:bookmarkEnd w:id="88"/>
+      <w:bookmarkEnd w:id="89"/>
     </w:p>
     <w:p>
       <w:pPr>
@@ -12836,25 +12686,25 @@
           <w:szCs w:val="24"/>
         </w:rPr>
       </w:pPr>
-      <w:bookmarkStart w:id="89" w:name="_Toc430943237"/>
-      <w:bookmarkStart w:id="90" w:name="_Toc430958129"/>
+      <w:bookmarkStart w:id="90" w:name="_Toc430943237"/>
+      <w:bookmarkStart w:id="91" w:name="_Toc430958129"/>
     </w:p>
     <w:p>
       <w:pPr>
         <w:pStyle w:val="2a"/>
       </w:pPr>
-      <w:bookmarkStart w:id="91" w:name="_Toc209703500"/>
-      <w:bookmarkStart w:id="92" w:name="_Toc221000973"/>
+      <w:bookmarkStart w:id="92" w:name="_Toc209703500"/>
+      <w:bookmarkStart w:id="93" w:name="_Toc221000973"/>
       <w:r>
         <w:t>10</w:t>
       </w:r>
       <w:r>
         <w:t>. Действия производственного персонала и аварийно-спасательных служб (формирований) по локализации и ликвидации аварийных ситуаций на ОПО</w:t>
       </w:r>
-      <w:bookmarkEnd w:id="89"/>
       <w:bookmarkEnd w:id="90"/>
       <w:bookmarkEnd w:id="91"/>
       <w:bookmarkEnd w:id="92"/>
+      <w:bookmarkEnd w:id="93"/>
     </w:p>
     <w:p>
       <w:pPr>
@@ -12880,6 +12730,7 @@
           </w:placeholder>
           <w:text/>
         </w:sdtPr>
+        <w:sdtEndPr/>
         <w:sdtContent>
           <w:r>
             <w:t>${OBJ_LINC_TEXT_9_TABLE}</w:t>
@@ -12898,6 +12749,7 @@
           </w:placeholder>
           <w:text/>
         </w:sdtPr>
+        <w:sdtEndPr/>
         <w:sdtContent>
           <w:r>
             <w:t>${OBJ_NUM_9_TABLE}</w:t>
@@ -12919,16 +12771,16 @@
       <w:pPr>
         <w:pStyle w:val="2a"/>
       </w:pPr>
-      <w:bookmarkStart w:id="93" w:name="_Toc209703501"/>
-      <w:bookmarkStart w:id="94" w:name="_Toc221000974"/>
+      <w:bookmarkStart w:id="94" w:name="_Toc209703501"/>
+      <w:bookmarkStart w:id="95" w:name="_Toc221000974"/>
       <w:r>
         <w:t>11</w:t>
       </w:r>
       <w:r>
         <w:t>. Мероприятия, направленные на обеспечение безопасности населения</w:t>
       </w:r>
-      <w:bookmarkEnd w:id="93"/>
       <w:bookmarkEnd w:id="94"/>
+      <w:bookmarkEnd w:id="95"/>
     </w:p>
     <w:p>
       <w:pPr>
@@ -13595,8 +13447,8 @@
       <w:pPr>
         <w:pStyle w:val="2a"/>
       </w:pPr>
-      <w:bookmarkStart w:id="95" w:name="_Toc209703502"/>
-      <w:bookmarkStart w:id="96" w:name="_Toc221000975"/>
+      <w:bookmarkStart w:id="96" w:name="_Toc209703502"/>
+      <w:bookmarkStart w:id="97" w:name="_Toc221000975"/>
       <w:r>
         <w:t>1</w:t>
       </w:r>
@@ -13606,8 +13458,8 @@
       <w:r>
         <w:t>. Организация материально-технического, инженерного и финансового обеспечения операций по локализации и ликвидации аварий на объекте</w:t>
       </w:r>
-      <w:bookmarkEnd w:id="95"/>
       <w:bookmarkEnd w:id="96"/>
+      <w:bookmarkEnd w:id="97"/>
     </w:p>
     <w:p>
       <w:pPr>
@@ -13636,6 +13488,7 @@
           </w:placeholder>
           <w:text/>
         </w:sdtPr>
+        <w:sdtEndPr/>
         <w:sdtContent>
           <w:r>
             <w:t>${OBJ_ORDER_MINIMUM_BALANCE_NUMBER}</w:t>
@@ -13654,6 +13507,7 @@
           </w:placeholder>
           <w:text/>
         </w:sdtPr>
+        <w:sdtEndPr/>
         <w:sdtContent>
           <w:r>
             <w:t>${OBJ_ORDER_MINIMUM_BALANCE_DATE}</w:t>
@@ -13769,6 +13623,7 @@
           </w:placeholder>
           <w:text/>
         </w:sdtPr>
+        <w:sdtEndPr/>
         <w:sdtContent>
           <w:r>
             <w:t>${OBJ_INSURANCE_POLICY_NUMBER}</w:t>
@@ -13796,6 +13651,7 @@
           </w:placeholder>
           <w:text/>
         </w:sdtPr>
+        <w:sdtEndPr/>
         <w:sdtContent>
           <w:r>
             <w:t>${OBJ_INSURANCE_POLICY_DATE}</w:t>
@@ -13813,34 +13669,43 @@
       <w:pPr>
         <w:pStyle w:val="1"/>
       </w:pPr>
-      <w:bookmarkStart w:id="97" w:name="_Toc394651834"/>
-      <w:bookmarkStart w:id="98" w:name="_Toc430097612"/>
-      <w:bookmarkStart w:id="99" w:name="_Toc430255939"/>
-      <w:bookmarkStart w:id="100" w:name="_Toc209703503"/>
-      <w:bookmarkStart w:id="101" w:name="_Toc221000976"/>
+      <w:bookmarkStart w:id="98" w:name="_Toc394651834"/>
+      <w:bookmarkStart w:id="99" w:name="_Toc430097612"/>
+      <w:bookmarkStart w:id="100" w:name="_Toc430255939"/>
+      <w:bookmarkStart w:id="101" w:name="_Toc209703503"/>
+      <w:bookmarkStart w:id="102" w:name="_Toc221000976"/>
       <w:r>
         <w:lastRenderedPageBreak/>
         <w:t>Специальные разделы плана мероприятий</w:t>
       </w:r>
-      <w:bookmarkEnd w:id="97"/>
       <w:bookmarkEnd w:id="98"/>
       <w:bookmarkEnd w:id="99"/>
       <w:bookmarkEnd w:id="100"/>
       <w:bookmarkEnd w:id="101"/>
+      <w:bookmarkEnd w:id="102"/>
     </w:p>
     <w:p>
       <w:pPr>
         <w:spacing w:after="0" w:line="240" w:lineRule="auto"/>
         <w:ind w:firstLine="709"/>
+        <w:rPr>
+          <w:lang w:val="en-US"/>
+        </w:rPr>
       </w:pPr>
       <w:r>
         <w:t>Таблица</w:t>
       </w:r>
       <w:r>
+        <w:rPr>
+          <w:lang w:val="en-US"/>
+        </w:rPr>
         <w:t xml:space="preserve"> </w:t>
       </w:r>
       <w:sdt>
         <w:sdtPr>
+          <w:rPr>
+            <w:lang w:val="en-US"/>
+          </w:rPr>
           <w:tag w:val="OBJ_NUM_9_TABLE"/>
           <w:id w:val="281387101"/>
           <w:placeholder>
@@ -13848,17 +13713,27 @@
           </w:placeholder>
           <w:text/>
         </w:sdtPr>
+        <w:sdtEndPr/>
         <w:sdtContent>
           <w:r>
+            <w:rPr>
+              <w:lang w:val="en-US"/>
+            </w:rPr>
             <w:t>${OBJ_NUM_9_TABLE}</w:t>
           </w:r>
         </w:sdtContent>
       </w:sdt>
       <w:r>
+        <w:rPr>
+          <w:lang w:val="en-US"/>
+        </w:rPr>
         <w:t xml:space="preserve"> – </w:t>
       </w:r>
       <w:sdt>
         <w:sdtPr>
+          <w:rPr>
+            <w:lang w:val="en-US"/>
+          </w:rPr>
           <w:tag w:val="OBJ_TEXT_NAME_9_TABLE"/>
           <w:id w:val="-1704402631"/>
           <w:placeholder>
@@ -13866,8 +13741,12 @@
           </w:placeholder>
           <w:text/>
         </w:sdtPr>
+        <w:sdtEndPr/>
         <w:sdtContent>
           <w:r>
+            <w:rPr>
+              <w:lang w:val="en-US"/>
+            </w:rPr>
             <w:t>${OBJ_TEXT_NAME_9_TABLE}</w:t>
           </w:r>
         </w:sdtContent>
@@ -13877,13 +13756,17 @@
       <w:pPr>
         <w:spacing w:after="0" w:line="240" w:lineRule="auto"/>
         <w:ind w:firstLine="709"/>
+        <w:rPr>
+          <w:lang w:val="en-US"/>
+        </w:rPr>
       </w:pPr>
     </w:p>
     <w:tbl>
       <w:tblPr>
         <w:tblStyle w:val="afb"/>
-        <w:tblW w:w="15452" w:type="dxa"/>
+        <w:tblW w:w="0" w:type="auto"/>
         <w:tblInd w:w="-431" w:type="dxa"/>
+        <w:tblLayout w:type="fixed"/>
         <w:tblLook w:val="0400" w:firstRow="0" w:lastRow="0" w:firstColumn="0" w:lastColumn="0" w:noHBand="0" w:noVBand="1"/>
       </w:tblPr>
       <w:tblGrid>
@@ -14077,7 +13960,7 @@
               <w:suppressAutoHyphens/>
             </w:pPr>
             <w:r>
-              <w:t>-загазованность территории, специфический запах природного газа;</w:t>
+              <w:t xml:space="preserve">-загазованность территории, специфический запах </w:t>
             </w:r>
           </w:p>
           <w:p>
@@ -14086,8 +13969,24 @@
               <w:widowControl w:val="0"/>
               <w:suppressAutoHyphens/>
             </w:pPr>
-            <w:r>
-              <w:t>- шум (свист), создаваемый истекающим газом;</w:t>
+            <w:sdt>
+              <w:sdtPr>
+                <w:tag w:val="OBJ_HAZARDOUS_SUBSTANCE_SHORT"/>
+                <w:id w:val="209077722"/>
+                <w:placeholder>
+                  <w:docPart w:val="F0A2C5069A704B43895A349CCA78D31C"/>
+                </w:placeholder>
+                <w:text/>
+              </w:sdtPr>
+              <w:sdtEndPr/>
+              <w:sdtContent>
+                <w:r>
+                  <w:t>${OBJ_HAZARDOUS_SUBSTANCE_SHORT}</w:t>
+                </w:r>
+              </w:sdtContent>
+            </w:sdt>
+            <w:r>
+              <w:t>;</w:t>
             </w:r>
           </w:p>
           <w:p>
@@ -14097,11 +13996,18 @@
               <w:suppressAutoHyphens/>
             </w:pPr>
             <w:r>
-              <w:t xml:space="preserve">- срабатывание световой и </w:t>
-            </w:r>
+              <w:t>- шум (свист), создаваемый истекающим газом;</w:t>
+            </w:r>
+          </w:p>
+          <w:p>
+            <w:pPr>
+              <w:pStyle w:val="15"/>
+              <w:widowControl w:val="0"/>
+              <w:suppressAutoHyphens/>
+            </w:pPr>
             <w:r>
               <w:lastRenderedPageBreak/>
-              <w:t>звуковой сигнализации.</w:t>
+              <w:t>- срабатывание световой и звуковой сигнализации.</w:t>
             </w:r>
           </w:p>
           <w:p>
@@ -14185,9 +14091,55 @@
               <w:pStyle w:val="15"/>
               <w:widowControl w:val="0"/>
               <w:suppressAutoHyphens/>
+              <w:rPr>
+                <w:lang w:val="en-US"/>
+              </w:rPr>
             </w:pPr>
             <w:r>
-              <w:t>Прекращение подачи природного газа.</w:t>
+              <w:t>Прекращение</w:t>
+            </w:r>
+            <w:r>
+              <w:rPr>
+                <w:lang w:val="en-US"/>
+              </w:rPr>
+              <w:t xml:space="preserve"> </w:t>
+            </w:r>
+            <w:r>
+              <w:t>подачи</w:t>
+            </w:r>
+            <w:r>
+              <w:rPr>
+                <w:lang w:val="en-US"/>
+              </w:rPr>
+              <w:t xml:space="preserve"> </w:t>
+            </w:r>
+            <w:sdt>
+              <w:sdtPr>
+                <w:rPr>
+                  <w:lang w:val="en-US"/>
+                </w:rPr>
+                <w:tag w:val="OBJ_HAZARDOUS_SUBSTANCE_SHORT"/>
+                <w:id w:val="1867794743"/>
+                <w:placeholder>
+                  <w:docPart w:val="FB5EA45044FD4518848018693794797E"/>
+                </w:placeholder>
+                <w:text/>
+              </w:sdtPr>
+              <w:sdtEndPr/>
+              <w:sdtContent>
+                <w:r>
+                  <w:rPr>
+                    <w:lang w:val="en-US"/>
+                  </w:rPr>
+                  <w:t>${OBJ_HAZARDOUS_SUBSTANCE_SHORT}</w:t>
+                </w:r>
+              </w:sdtContent>
+            </w:sdt>
+            <w:r>
+              <w:rPr>
+                <w:lang w:val="en-US"/>
+              </w:rPr>
+              <w:t>.</w:t>
             </w:r>
           </w:p>
           <w:p>
@@ -14238,7 +14190,26 @@
               <w:suppressAutoHyphens/>
             </w:pPr>
             <w:r>
-              <w:t>Контрольно- измерительные приборы учета давления, расхода природного газа.</w:t>
+              <w:t xml:space="preserve">Контрольно- измерительные приборы учета давления, расхода </w:t>
+            </w:r>
+            <w:sdt>
+              <w:sdtPr>
+                <w:tag w:val="OBJ_HAZARDOUS_SUBSTANCE_SHORT"/>
+                <w:id w:val="783161716"/>
+                <w:placeholder>
+                  <w:docPart w:val="D948EFB7A8D345D189F3B1985D70A1C6"/>
+                </w:placeholder>
+                <w:text/>
+              </w:sdtPr>
+              <w:sdtEndPr/>
+              <w:sdtContent>
+                <w:r>
+                  <w:t>${OBJ_HAZARDOUS_SUBSTANCE_SHORT}</w:t>
+                </w:r>
+              </w:sdtContent>
+            </w:sdt>
+            <w:r>
+              <w:t>.</w:t>
             </w:r>
           </w:p>
           <w:p>
@@ -14371,6 +14342,7 @@
                 </w:placeholder>
                 <w:text/>
               </w:sdtPr>
+              <w:sdtEndPr/>
               <w:sdtContent>
                 <w:r>
                   <w:rPr>
@@ -14398,6 +14370,7 @@
                 </w:placeholder>
                 <w:text/>
               </w:sdtPr>
+              <w:sdtEndPr/>
               <w:sdtContent>
                 <w:r>
                   <w:rPr>
@@ -14425,6 +14398,7 @@
                 </w:placeholder>
                 <w:text/>
               </w:sdtPr>
+              <w:sdtEndPr/>
               <w:sdtContent>
                 <w:r>
                   <w:rPr>
@@ -14584,6 +14558,7 @@
                 </w:placeholder>
                 <w:text/>
               </w:sdtPr>
+              <w:sdtEndPr/>
               <w:sdtContent>
                 <w:r>
                   <w:t>${ASF_STATUS_SHORT}</w:t>
@@ -14602,6 +14577,7 @@
                 </w:placeholder>
                 <w:text/>
               </w:sdtPr>
+              <w:sdtEndPr/>
               <w:sdtContent>
                 <w:r>
                   <w:t>${ASF_SHORT_NAME}</w:t>
@@ -14623,6 +14599,7 @@
                 </w:placeholder>
                 <w:text/>
               </w:sdtPr>
+              <w:sdtEndPr/>
               <w:sdtContent>
                 <w:r>
                   <w:t>${ASF_ARRIVAL_TIME}</w:t>
@@ -14724,10 +14701,56 @@
               <w:pStyle w:val="15"/>
               <w:widowControl w:val="0"/>
               <w:suppressAutoHyphens/>
+              <w:rPr>
+                <w:lang w:val="en-US"/>
+              </w:rPr>
             </w:pPr>
             <w:r>
               <w:lastRenderedPageBreak/>
-              <w:t xml:space="preserve">Факельное горение природного газа </w:t>
+              <w:t>Факельное</w:t>
+            </w:r>
+            <w:r>
+              <w:rPr>
+                <w:lang w:val="en-US"/>
+              </w:rPr>
+              <w:t xml:space="preserve"> </w:t>
+            </w:r>
+            <w:r>
+              <w:t>горение</w:t>
+            </w:r>
+            <w:r>
+              <w:rPr>
+                <w:lang w:val="en-US"/>
+              </w:rPr>
+              <w:t xml:space="preserve"> </w:t>
+            </w:r>
+            <w:sdt>
+              <w:sdtPr>
+                <w:rPr>
+                  <w:lang w:val="en-US"/>
+                </w:rPr>
+                <w:tag w:val="OBJ_HAZARDOUS_SUBSTANCE_SHORT"/>
+                <w:id w:val="2023120824"/>
+                <w:placeholder>
+                  <w:docPart w:val="04FA96F9E0714A00A650074D6BAB007A"/>
+                </w:placeholder>
+                <w:text/>
+              </w:sdtPr>
+              <w:sdtEndPr/>
+              <w:sdtContent>
+                <w:r>
+                  <w:rPr>
+                    <w:lang w:val="en-US"/>
+                  </w:rPr>
+                  <w:t>${OBJ_HAZARDOUS_SUBSTANCE_SHORT}</w:t>
+                </w:r>
+              </w:sdtContent>
+            </w:sdt>
+            <w:r>
+              <w:rPr>
+                <w:lang w:val="en-US"/>
+              </w:rPr>
+              <w:t xml:space="preserve"> </w:t>
             </w:r>
           </w:p>
         </w:tc>
@@ -14883,7 +14906,26 @@
               <w:suppressAutoHyphens/>
             </w:pPr>
             <w:r>
-              <w:t xml:space="preserve">Прекращение подачи природного газа </w:t>
+              <w:t xml:space="preserve">Прекращение подачи </w:t>
+            </w:r>
+            <w:sdt>
+              <w:sdtPr>
+                <w:tag w:val="OBJ_HAZARDOUS_SUBSTANCE_SHORT"/>
+                <w:id w:val="446283322"/>
+                <w:placeholder>
+                  <w:docPart w:val="3E7D4BEFBDDE4B9EA17B988F058BC7CE"/>
+                </w:placeholder>
+                <w:text/>
+              </w:sdtPr>
+              <w:sdtEndPr/>
+              <w:sdtContent>
+                <w:r>
+                  <w:t>${OBJ_HAZARDOUS_SUBSTANCE_SHORT}</w:t>
+                </w:r>
+              </w:sdtContent>
+            </w:sdt>
+            <w:r>
+              <w:t xml:space="preserve"> </w:t>
             </w:r>
             <w:r>
               <w:t xml:space="preserve">в </w:t>
@@ -14946,7 +14988,26 @@
               <w:suppressAutoHyphens/>
             </w:pPr>
             <w:r>
-              <w:t>Контрольно- измерительные приборы учета давления, расхода природного газа.</w:t>
+              <w:t xml:space="preserve">Контрольно- измерительные приборы учета давления, расхода </w:t>
+            </w:r>
+            <w:sdt>
+              <w:sdtPr>
+                <w:tag w:val="OBJ_HAZARDOUS_SUBSTANCE_SHORT"/>
+                <w:id w:val="-210659797"/>
+                <w:placeholder>
+                  <w:docPart w:val="0C8C586799AD451993087FF0A7EED967"/>
+                </w:placeholder>
+                <w:text/>
+              </w:sdtPr>
+              <w:sdtEndPr/>
+              <w:sdtContent>
+                <w:r>
+                  <w:t>${OBJ_HAZARDOUS_SUBSTANCE_SHORT}</w:t>
+                </w:r>
+              </w:sdtContent>
+            </w:sdt>
+            <w:r>
+              <w:t>.</w:t>
             </w:r>
           </w:p>
           <w:p>
@@ -15089,6 +15150,7 @@
                 </w:placeholder>
                 <w:text/>
               </w:sdtPr>
+              <w:sdtEndPr/>
               <w:sdtContent>
                 <w:r>
                   <w:rPr>
@@ -15116,6 +15178,7 @@
                 </w:placeholder>
                 <w:text/>
               </w:sdtPr>
+              <w:sdtEndPr/>
               <w:sdtContent>
                 <w:r>
                   <w:rPr>
@@ -15143,6 +15206,7 @@
                 </w:placeholder>
                 <w:text/>
               </w:sdtPr>
+              <w:sdtEndPr/>
               <w:sdtContent>
                 <w:r>
                   <w:rPr>
@@ -15321,6 +15385,7 @@
                 </w:placeholder>
                 <w:text/>
               </w:sdtPr>
+              <w:sdtEndPr/>
               <w:sdtContent>
                 <w:r>
                   <w:t>${ASF_STATUS_SHORT}</w:t>
@@ -15339,6 +15404,7 @@
                 </w:placeholder>
                 <w:text/>
               </w:sdtPr>
+              <w:sdtEndPr/>
               <w:sdtContent>
                 <w:r>
                   <w:t>${ASF_SHORT_NAME}</w:t>
@@ -15360,6 +15426,7 @@
                 </w:placeholder>
                 <w:text/>
               </w:sdtPr>
+              <w:sdtEndPr/>
               <w:sdtContent>
                 <w:r>
                   <w:t>${ASF_ARRIVAL_TIME}</w:t>
@@ -15683,7 +15750,26 @@
               <w:spacing w:after="0" w:line="240" w:lineRule="auto"/>
             </w:pPr>
             <w:r>
-              <w:t xml:space="preserve">Прекращение подачи природного газа </w:t>
+              <w:t xml:space="preserve">Прекращение подачи </w:t>
+            </w:r>
+            <w:sdt>
+              <w:sdtPr>
+                <w:tag w:val="OBJ_HAZARDOUS_SUBSTANCE_SHORT"/>
+                <w:id w:val="-1839305322"/>
+                <w:placeholder>
+                  <w:docPart w:val="30D6536E80784AAD9BD4C7636F840AA7"/>
+                </w:placeholder>
+                <w:text/>
+              </w:sdtPr>
+              <w:sdtEndPr/>
+              <w:sdtContent>
+                <w:r>
+                  <w:t>${OBJ_HAZARDOUS_SUBSTANCE_SHORT}</w:t>
+                </w:r>
+              </w:sdtContent>
+            </w:sdt>
+            <w:r>
+              <w:t xml:space="preserve"> </w:t>
             </w:r>
             <w:r>
               <w:t xml:space="preserve">в </w:t>
@@ -15709,7 +15795,11 @@
               <w:spacing w:after="0" w:line="240" w:lineRule="auto"/>
             </w:pPr>
             <w:r>
-              <w:t>Аварийное освобождение трубопровода на свечу.</w:t>
+              <w:t xml:space="preserve">Аварийное освобождение трубопровода на </w:t>
+            </w:r>
+            <w:r>
+              <w:lastRenderedPageBreak/>
+              <w:t>свечу.</w:t>
             </w:r>
           </w:p>
         </w:tc>
@@ -15724,6 +15814,7 @@
               <w:spacing w:after="0" w:line="240" w:lineRule="auto"/>
             </w:pPr>
             <w:r>
+              <w:lastRenderedPageBreak/>
               <w:t xml:space="preserve">Ручная </w:t>
             </w:r>
             <w:r>
@@ -15746,7 +15837,26 @@
               <w:spacing w:after="0" w:line="240" w:lineRule="auto"/>
             </w:pPr>
             <w:r>
-              <w:t>Контрольно-измерительные приборы учета давления, расхода природного газа.</w:t>
+              <w:t xml:space="preserve">Контрольно-измерительные приборы учета давления, расхода </w:t>
+            </w:r>
+            <w:sdt>
+              <w:sdtPr>
+                <w:tag w:val="OBJ_HAZARDOUS_SUBSTANCE_SHORT"/>
+                <w:id w:val="-1138798133"/>
+                <w:placeholder>
+                  <w:docPart w:val="BA63E205CD5942F6ACB2FA8EACAECE45"/>
+                </w:placeholder>
+                <w:text/>
+              </w:sdtPr>
+              <w:sdtEndPr/>
+              <w:sdtContent>
+                <w:r>
+                  <w:t>${OBJ_HAZARDOUS_SUBSTANCE_SHORT}</w:t>
+                </w:r>
+              </w:sdtContent>
+            </w:sdt>
+            <w:r>
+              <w:t>.</w:t>
             </w:r>
           </w:p>
           <w:p>
@@ -15776,11 +15886,8 @@
               <w:spacing w:after="0" w:line="240" w:lineRule="auto"/>
             </w:pPr>
             <w:r>
-              <w:t xml:space="preserve">Первичные средства </w:t>
-            </w:r>
-            <w:r>
               <w:lastRenderedPageBreak/>
-              <w:t>пожаротушения.</w:t>
+              <w:t>Первичные средства пожаротушения.</w:t>
             </w:r>
           </w:p>
           <w:p>
@@ -16029,6 +16136,7 @@
                 </w:placeholder>
                 <w:text/>
               </w:sdtPr>
+              <w:sdtEndPr/>
               <w:sdtContent>
                 <w:r>
                   <w:rPr>
@@ -16056,6 +16164,7 @@
                 </w:placeholder>
                 <w:text/>
               </w:sdtPr>
+              <w:sdtEndPr/>
               <w:sdtContent>
                 <w:r>
                   <w:rPr>
@@ -16079,7 +16188,29 @@
               <w:spacing w:after="0" w:line="240" w:lineRule="auto"/>
             </w:pPr>
             <w:r>
-              <w:t>- участвует в проведении аварийно-спасательных работ, по согласованию с ответственным руководителем принимает меры по отключению и освобождению трубопровода природного газа;</w:t>
+              <w:t xml:space="preserve">- участвует в проведении аварийно-спасательных работ, по согласованию с ответственным руководителем принимает меры по отключению и освобождению трубопровода </w:t>
+            </w:r>
+            <w:r>
+              <w:t xml:space="preserve">от </w:t>
+            </w:r>
+            <w:sdt>
+              <w:sdtPr>
+                <w:tag w:val="OBJ_HAZARDOUS_SUBSTANCE_GEN"/>
+                <w:id w:val="102079404"/>
+                <w:placeholder>
+                  <w:docPart w:val="7B75A27B1766406481E569A14702411D"/>
+                </w:placeholder>
+                <w:text/>
+              </w:sdtPr>
+              <w:sdtEndPr/>
+              <w:sdtContent>
+                <w:r>
+                  <w:t>${OBJ_HAZARDOUS_SUBSTANCE_SHORT}</w:t>
+                </w:r>
+              </w:sdtContent>
+            </w:sdt>
+            <w:r>
+              <w:t>;</w:t>
             </w:r>
           </w:p>
           <w:p>
@@ -16321,7 +16452,11 @@
               <w:t>В</w:t>
             </w:r>
             <w:r>
-              <w:t>ывод персонала из опасной зоны.</w:t>
+              <w:t xml:space="preserve">ывод персонала </w:t>
+            </w:r>
+            <w:r>
+              <w:lastRenderedPageBreak/>
+              <w:t>из опасной зоны.</w:t>
             </w:r>
           </w:p>
         </w:tc>
@@ -16336,6 +16471,7 @@
               <w:spacing w:after="0" w:line="240" w:lineRule="auto"/>
             </w:pPr>
             <w:r>
+              <w:lastRenderedPageBreak/>
               <w:t>Запорная арматура (ручная, автоматическая).</w:t>
             </w:r>
           </w:p>
@@ -16475,6 +16611,7 @@
               <w:spacing w:after="0" w:line="240" w:lineRule="auto"/>
             </w:pPr>
             <w:r>
+              <w:lastRenderedPageBreak/>
               <w:t>вызывает экстренные службы по номеру 112;</w:t>
             </w:r>
           </w:p>
@@ -16485,7 +16622,6 @@
               <w:spacing w:after="0" w:line="240" w:lineRule="auto"/>
             </w:pPr>
             <w:r>
-              <w:lastRenderedPageBreak/>
               <w:t xml:space="preserve">- </w:t>
             </w:r>
             <w:r>
@@ -16534,14 +16670,14 @@
           <w:lang w:eastAsia="en-US"/>
         </w:rPr>
       </w:pPr>
-      <w:bookmarkStart w:id="102" w:name="_Toc414022297"/>
-      <w:bookmarkStart w:id="103" w:name="_Toc427057254"/>
-      <w:bookmarkStart w:id="104" w:name="_Toc431390633"/>
-      <w:bookmarkStart w:id="105" w:name="_Toc209703504"/>
-      <w:bookmarkStart w:id="106" w:name="_Toc221000977"/>
-      <w:bookmarkStart w:id="107" w:name="_Toc427057264"/>
-      <w:bookmarkStart w:id="108" w:name="_Toc430943242"/>
-      <w:bookmarkStart w:id="109" w:name="_Toc430958131"/>
+      <w:bookmarkStart w:id="103" w:name="_Toc414022297"/>
+      <w:bookmarkStart w:id="104" w:name="_Toc427057254"/>
+      <w:bookmarkStart w:id="105" w:name="_Toc431390633"/>
+      <w:bookmarkStart w:id="106" w:name="_Toc209703504"/>
+      <w:bookmarkStart w:id="107" w:name="_Toc221000977"/>
+      <w:bookmarkStart w:id="108" w:name="_Toc427057264"/>
+      <w:bookmarkStart w:id="109" w:name="_Toc430943242"/>
+      <w:bookmarkStart w:id="110" w:name="_Toc430958131"/>
       <w:r>
         <w:rPr>
           <w:lang w:eastAsia="en-US"/>
@@ -16555,11 +16691,11 @@
         </w:rPr>
         <w:t>. Распределение обязанностей между отдельными лицами, участвующими в ликвидации аварии</w:t>
       </w:r>
-      <w:bookmarkEnd w:id="102"/>
       <w:bookmarkEnd w:id="103"/>
       <w:bookmarkEnd w:id="104"/>
       <w:bookmarkEnd w:id="105"/>
       <w:bookmarkEnd w:id="106"/>
+      <w:bookmarkEnd w:id="107"/>
     </w:p>
     <w:p>
       <w:pPr>
@@ -16573,16 +16709,16 @@
       <w:pPr>
         <w:pStyle w:val="2a"/>
       </w:pPr>
-      <w:bookmarkStart w:id="110" w:name="_Toc209703505"/>
-      <w:bookmarkStart w:id="111" w:name="_Toc221000978"/>
+      <w:bookmarkStart w:id="111" w:name="_Toc209703505"/>
+      <w:bookmarkStart w:id="112" w:name="_Toc221000978"/>
       <w:r>
         <w:t>13.</w:t>
       </w:r>
       <w:r>
         <w:t>1. Общие положения</w:t>
       </w:r>
-      <w:bookmarkEnd w:id="110"/>
       <w:bookmarkEnd w:id="111"/>
+      <w:bookmarkEnd w:id="112"/>
     </w:p>
     <w:p>
       <w:pPr>
@@ -16948,6 +17084,7 @@
           </w:placeholder>
           <w:text/>
         </w:sdtPr>
+        <w:sdtEndPr/>
         <w:sdtContent>
           <w:r>
             <w:rPr>
@@ -17002,6 +17139,7 @@
           </w:placeholder>
           <w:text/>
         </w:sdtPr>
+        <w:sdtEndPr/>
         <w:sdtContent>
           <w:r>
             <w:rPr>
@@ -17088,6 +17226,7 @@
           </w:placeholder>
           <w:text/>
         </w:sdtPr>
+        <w:sdtEndPr/>
         <w:sdtContent>
           <w:r>
             <w:rPr>
@@ -17124,8 +17263,8 @@
       <w:pPr>
         <w:pStyle w:val="2a"/>
       </w:pPr>
-      <w:bookmarkStart w:id="112" w:name="_Toc209703506"/>
-      <w:bookmarkStart w:id="113" w:name="_Toc221000979"/>
+      <w:bookmarkStart w:id="113" w:name="_Toc209703506"/>
+      <w:bookmarkStart w:id="114" w:name="_Toc221000979"/>
       <w:r>
         <w:t>13.</w:t>
       </w:r>
@@ -17138,8 +17277,8 @@
       <w:r>
         <w:t xml:space="preserve"> руководителем выполняется следующий комплекс мер:</w:t>
       </w:r>
-      <w:bookmarkEnd w:id="112"/>
       <w:bookmarkEnd w:id="113"/>
+      <w:bookmarkEnd w:id="114"/>
     </w:p>
     <w:p>
       <w:pPr>
@@ -17558,16 +17697,16 @@
       <w:pPr>
         <w:pStyle w:val="2a"/>
       </w:pPr>
-      <w:bookmarkStart w:id="114" w:name="_Toc209703507"/>
-      <w:bookmarkStart w:id="115" w:name="_Toc221000980"/>
+      <w:bookmarkStart w:id="115" w:name="_Toc209703507"/>
+      <w:bookmarkStart w:id="116" w:name="_Toc221000980"/>
       <w:r>
         <w:t>13.</w:t>
       </w:r>
       <w:r>
         <w:t>3. Обязанности технического руководителя</w:t>
       </w:r>
-      <w:bookmarkEnd w:id="114"/>
       <w:bookmarkEnd w:id="115"/>
+      <w:bookmarkEnd w:id="116"/>
     </w:p>
     <w:p>
       <w:pPr>
@@ -17976,8 +18115,8 @@
       <w:pPr>
         <w:pStyle w:val="2a"/>
       </w:pPr>
-      <w:bookmarkStart w:id="116" w:name="_Toc209703508"/>
-      <w:bookmarkStart w:id="117" w:name="_Toc221000981"/>
+      <w:bookmarkStart w:id="117" w:name="_Toc209703508"/>
+      <w:bookmarkStart w:id="118" w:name="_Toc221000981"/>
       <w:r>
         <w:t>13.4.</w:t>
       </w:r>
@@ -17990,8 +18129,8 @@
       <w:r>
         <w:t xml:space="preserve"> </w:t>
       </w:r>
-      <w:bookmarkStart w:id="118" w:name="_Hlk221183206"/>
-      <w:bookmarkEnd w:id="116"/>
+      <w:bookmarkStart w:id="119" w:name="_Hlk221183206"/>
+      <w:bookmarkEnd w:id="117"/>
       <w:sdt>
         <w:sdtPr>
           <w:rPr>
@@ -18004,6 +18143,7 @@
           </w:placeholder>
           <w:text/>
         </w:sdtPr>
+        <w:sdtEndPr/>
         <w:sdtContent>
           <w:r>
             <w:rPr>
@@ -18013,8 +18153,8 @@
           </w:r>
         </w:sdtContent>
       </w:sdt>
-      <w:bookmarkEnd w:id="117"/>
       <w:bookmarkEnd w:id="118"/>
+      <w:bookmarkEnd w:id="119"/>
     </w:p>
     <w:p>
       <w:pPr>
@@ -18161,6 +18301,7 @@
           </w:placeholder>
           <w:text/>
         </w:sdtPr>
+        <w:sdtEndPr/>
         <w:sdtContent>
           <w:r>
             <w:rPr>
@@ -18430,8 +18571,8 @@
       <w:pPr>
         <w:pStyle w:val="2a"/>
       </w:pPr>
-      <w:bookmarkStart w:id="119" w:name="_Toc209703509"/>
-      <w:bookmarkStart w:id="120" w:name="_Toc221000982"/>
+      <w:bookmarkStart w:id="120" w:name="_Toc209703509"/>
+      <w:bookmarkStart w:id="121" w:name="_Toc221000982"/>
       <w:r>
         <w:t>13.</w:t>
       </w:r>
@@ -18441,8 +18582,8 @@
       <w:r>
         <w:t>начальника участка</w:t>
       </w:r>
-      <w:bookmarkEnd w:id="119"/>
       <w:bookmarkEnd w:id="120"/>
+      <w:bookmarkEnd w:id="121"/>
     </w:p>
     <w:p>
       <w:pPr>
@@ -18716,8 +18857,8 @@
       <w:pPr>
         <w:pStyle w:val="2a"/>
       </w:pPr>
-      <w:bookmarkStart w:id="121" w:name="_Toc209703510"/>
-      <w:bookmarkStart w:id="122" w:name="_Toc221000983"/>
+      <w:bookmarkStart w:id="122" w:name="_Toc209703510"/>
+      <w:bookmarkStart w:id="123" w:name="_Toc221000983"/>
       <w:r>
         <w:t>13.</w:t>
       </w:r>
@@ -18727,11 +18868,11 @@
       <w:r>
         <w:t xml:space="preserve"> </w:t>
       </w:r>
-      <w:bookmarkEnd w:id="121"/>
+      <w:bookmarkEnd w:id="122"/>
       <w:r>
         <w:t>Объекта</w:t>
       </w:r>
-      <w:bookmarkEnd w:id="122"/>
+      <w:bookmarkEnd w:id="123"/>
     </w:p>
     <w:p>
       <w:pPr>
@@ -18807,6 +18948,7 @@
           </w:placeholder>
           <w:text/>
         </w:sdtPr>
+        <w:sdtEndPr/>
         <w:sdtContent>
           <w:r>
             <w:rPr>
@@ -18931,15 +19073,15 @@
       <w:pPr>
         <w:pStyle w:val="2a"/>
       </w:pPr>
-      <w:bookmarkStart w:id="123" w:name="_Toc209703511"/>
-      <w:bookmarkStart w:id="124" w:name="_Toc221000984"/>
+      <w:bookmarkStart w:id="124" w:name="_Toc209703511"/>
+      <w:bookmarkStart w:id="125" w:name="_Toc221000984"/>
       <w:r>
         <w:t>13.</w:t>
       </w:r>
       <w:r>
         <w:t xml:space="preserve">7. Обязанности членов </w:t>
       </w:r>
-      <w:bookmarkStart w:id="125" w:name="_Hlk221183488"/>
+      <w:bookmarkStart w:id="126" w:name="_Hlk221183488"/>
       <w:sdt>
         <w:sdtPr>
           <w:tag w:val="ASF_STATUS_SHORT"/>
@@ -18949,13 +19091,14 @@
           </w:placeholder>
           <w:text/>
         </w:sdtPr>
+        <w:sdtEndPr/>
         <w:sdtContent>
           <w:r>
             <w:t>${ASF_STATUS_SHORT}</w:t>
           </w:r>
         </w:sdtContent>
       </w:sdt>
-      <w:bookmarkEnd w:id="125"/>
+      <w:bookmarkEnd w:id="126"/>
       <w:r>
         <w:t xml:space="preserve"> </w:t>
       </w:r>
@@ -18968,14 +19111,15 @@
           </w:placeholder>
           <w:text/>
         </w:sdtPr>
+        <w:sdtEndPr/>
         <w:sdtContent>
           <w:r>
             <w:t>${ASF_SHORT_NAME}</w:t>
           </w:r>
         </w:sdtContent>
       </w:sdt>
-      <w:bookmarkEnd w:id="123"/>
       <w:bookmarkEnd w:id="124"/>
+      <w:bookmarkEnd w:id="125"/>
     </w:p>
     <w:p>
       <w:pPr>
@@ -19406,16 +19550,16 @@
       <w:pPr>
         <w:pStyle w:val="2a"/>
       </w:pPr>
-      <w:bookmarkStart w:id="126" w:name="_Toc209703512"/>
-      <w:bookmarkStart w:id="127" w:name="_Toc221000985"/>
+      <w:bookmarkStart w:id="127" w:name="_Toc209703512"/>
+      <w:bookmarkStart w:id="128" w:name="_Toc221000985"/>
       <w:r>
         <w:t>13.</w:t>
       </w:r>
       <w:r>
         <w:t>8. Обязанности начальника ПЧ</w:t>
       </w:r>
-      <w:bookmarkEnd w:id="126"/>
       <w:bookmarkEnd w:id="127"/>
+      <w:bookmarkEnd w:id="128"/>
     </w:p>
     <w:p>
       <w:pPr>
@@ -19713,16 +19857,16 @@
       <w:pPr>
         <w:pStyle w:val="2a"/>
       </w:pPr>
-      <w:bookmarkStart w:id="128" w:name="_Toc209703513"/>
-      <w:bookmarkStart w:id="129" w:name="_Toc221000986"/>
+      <w:bookmarkStart w:id="129" w:name="_Toc209703513"/>
+      <w:bookmarkStart w:id="130" w:name="_Toc221000986"/>
       <w:r>
         <w:t>13.</w:t>
       </w:r>
       <w:r>
         <w:t>9. Обязанности медицинского врача</w:t>
       </w:r>
-      <w:bookmarkEnd w:id="128"/>
       <w:bookmarkEnd w:id="129"/>
+      <w:bookmarkEnd w:id="130"/>
     </w:p>
     <w:p>
       <w:pPr>
@@ -19768,16 +19912,16 @@
       <w:pPr>
         <w:pStyle w:val="2a"/>
       </w:pPr>
-      <w:bookmarkStart w:id="130" w:name="_Toc209703514"/>
-      <w:bookmarkStart w:id="131" w:name="_Toc221000987"/>
+      <w:bookmarkStart w:id="131" w:name="_Toc209703514"/>
+      <w:bookmarkStart w:id="132" w:name="_Toc221000987"/>
       <w:r>
         <w:t>13.10</w:t>
       </w:r>
       <w:r>
         <w:t>. Служба безопасности</w:t>
       </w:r>
-      <w:bookmarkEnd w:id="130"/>
       <w:bookmarkEnd w:id="131"/>
+      <w:bookmarkEnd w:id="132"/>
     </w:p>
     <w:p>
       <w:pPr>
@@ -19815,16 +19959,16 @@
         <w:pStyle w:val="1"/>
         <w:jc w:val="left"/>
       </w:pPr>
-      <w:bookmarkStart w:id="132" w:name="_Toc433207695"/>
-      <w:bookmarkStart w:id="133" w:name="_Toc209703515"/>
-      <w:bookmarkStart w:id="134" w:name="_Toc221000988"/>
-      <w:bookmarkStart w:id="135" w:name="_Toc381802546"/>
-      <w:bookmarkStart w:id="136" w:name="_Toc391383493"/>
-      <w:bookmarkStart w:id="137" w:name="_Toc414977744"/>
-      <w:bookmarkStart w:id="138" w:name="_Toc430943246"/>
-      <w:bookmarkEnd w:id="107"/>
+      <w:bookmarkStart w:id="133" w:name="_Toc433207695"/>
+      <w:bookmarkStart w:id="134" w:name="_Toc209703515"/>
+      <w:bookmarkStart w:id="135" w:name="_Toc221000988"/>
+      <w:bookmarkStart w:id="136" w:name="_Toc381802546"/>
+      <w:bookmarkStart w:id="137" w:name="_Toc391383493"/>
+      <w:bookmarkStart w:id="138" w:name="_Toc414977744"/>
+      <w:bookmarkStart w:id="139" w:name="_Toc430943246"/>
       <w:bookmarkEnd w:id="108"/>
       <w:bookmarkEnd w:id="109"/>
+      <w:bookmarkEnd w:id="110"/>
       <w:r>
         <w:lastRenderedPageBreak/>
         <w:t xml:space="preserve">ПРИЛОЖЕНИЕ 1. Свидетельство на право ведения аварийно-спасательных работ в чрезвычайных ситуациях </w:t>
@@ -19838,6 +19982,7 @@
           </w:placeholder>
           <w:text/>
         </w:sdtPr>
+        <w:sdtEndPr/>
         <w:sdtContent>
           <w:r>
             <w:t>${ASF_STATUS_SHORT}</w:t>
@@ -19847,7 +19992,7 @@
       <w:r>
         <w:t xml:space="preserve"> </w:t>
       </w:r>
-      <w:bookmarkEnd w:id="132"/>
+      <w:bookmarkEnd w:id="133"/>
       <w:sdt>
         <w:sdtPr>
           <w:tag w:val="ASF_SHORT_NAME"/>
@@ -19857,14 +20002,15 @@
           </w:placeholder>
           <w:text/>
         </w:sdtPr>
+        <w:sdtEndPr/>
         <w:sdtContent>
           <w:r>
             <w:t>${ASF_SHORT_NAME}</w:t>
           </w:r>
         </w:sdtContent>
       </w:sdt>
-      <w:bookmarkEnd w:id="133"/>
       <w:bookmarkEnd w:id="134"/>
+      <w:bookmarkEnd w:id="135"/>
     </w:p>
     <w:p>
       <w:pPr>
@@ -19903,8 +20049,8 @@
         </w:rPr>
         <w:t>APPENDIX</w:t>
       </w:r>
-      <w:bookmarkStart w:id="139" w:name="_Toc209703516"/>
-      <w:bookmarkStart w:id="140" w:name="_Toc221000989"/>
+      <w:bookmarkStart w:id="140" w:name="_Toc209703516"/>
+      <w:bookmarkStart w:id="141" w:name="_Toc221000989"/>
     </w:p>
     <w:p>
       <w:pPr>
@@ -19932,12 +20078,12 @@
         </w:rPr>
         <w:t xml:space="preserve"> </w:t>
       </w:r>
-      <w:bookmarkEnd w:id="135"/>
       <w:bookmarkEnd w:id="136"/>
       <w:bookmarkEnd w:id="137"/>
       <w:bookmarkEnd w:id="138"/>
       <w:bookmarkEnd w:id="139"/>
       <w:bookmarkEnd w:id="140"/>
+      <w:bookmarkEnd w:id="141"/>
       <w:sdt>
         <w:sdtPr>
           <w:rPr>
@@ -19950,6 +20096,7 @@
           </w:placeholder>
           <w:text/>
         </w:sdtPr>
+        <w:sdtEndPr/>
         <w:sdtContent>
           <w:r>
             <w:rPr>
@@ -19977,6 +20124,7 @@
           </w:placeholder>
           <w:text/>
         </w:sdtPr>
+        <w:sdtEndPr/>
         <w:sdtContent>
           <w:r>
             <w:rPr>
@@ -20140,6 +20288,7 @@
       </w:placeholder>
       <w:text/>
     </w:sdtPr>
+    <w:sdtEndPr/>
     <w:sdtContent>
       <w:p>
         <w:pPr>
@@ -28361,6 +28510,325 @@
         </w:p>
       </w:docPartBody>
     </w:docPart>
+    <w:docPart>
+      <w:docPartPr>
+        <w:name w:val="7B75A27B1766406481E569A14702411D"/>
+        <w:category>
+          <w:name w:val="Общие"/>
+          <w:gallery w:val="placeholder"/>
+        </w:category>
+        <w:types>
+          <w:type w:val="bbPlcHdr"/>
+        </w:types>
+        <w:behaviors>
+          <w:behavior w:val="content"/>
+        </w:behaviors>
+        <w:guid w:val="{564918D2-3336-41C7-B88B-E5A97CE0639C}"/>
+      </w:docPartPr>
+      <w:docPartBody>
+        <w:p>
+          <w:pPr>
+            <w:pStyle w:val="7B75A27B1766406481E569A14702411D"/>
+          </w:pPr>
+          <w:r>
+            <w:rPr>
+              <w:rStyle w:val="a3"/>
+            </w:rPr>
+            <w:t>Место для ввода текста.</w:t>
+          </w:r>
+        </w:p>
+      </w:docPartBody>
+    </w:docPart>
+    <w:docPart>
+      <w:docPartPr>
+        <w:name w:val="92A3724C014543AFABF462BE25EDA8B5"/>
+        <w:category>
+          <w:name w:val="Общие"/>
+          <w:gallery w:val="placeholder"/>
+        </w:category>
+        <w:types>
+          <w:type w:val="bbPlcHdr"/>
+        </w:types>
+        <w:behaviors>
+          <w:behavior w:val="content"/>
+        </w:behaviors>
+        <w:guid w:val="{61757910-A1C9-4AAA-B090-501407E2E65D}"/>
+      </w:docPartPr>
+      <w:docPartBody>
+        <w:p>
+          <w:pPr>
+            <w:pStyle w:val="92A3724C014543AFABF462BE25EDA8B5"/>
+          </w:pPr>
+          <w:r>
+            <w:rPr>
+              <w:rStyle w:val="a3"/>
+            </w:rPr>
+            <w:t>Место для ввода текста.</w:t>
+          </w:r>
+        </w:p>
+      </w:docPartBody>
+    </w:docPart>
+    <w:docPart>
+      <w:docPartPr>
+        <w:name w:val="BE5808D8654F4D4D8ADF8498985F0C13"/>
+        <w:category>
+          <w:name w:val="Общие"/>
+          <w:gallery w:val="placeholder"/>
+        </w:category>
+        <w:types>
+          <w:type w:val="bbPlcHdr"/>
+        </w:types>
+        <w:behaviors>
+          <w:behavior w:val="content"/>
+        </w:behaviors>
+        <w:guid w:val="{E398FE5A-56CD-4F4A-9546-BD5D2D5120BD}"/>
+      </w:docPartPr>
+      <w:docPartBody>
+        <w:p>
+          <w:pPr>
+            <w:pStyle w:val="BE5808D8654F4D4D8ADF8498985F0C13"/>
+          </w:pPr>
+          <w:r>
+            <w:rPr>
+              <w:rStyle w:val="a3"/>
+            </w:rPr>
+            <w:t>Место для ввода текста.</w:t>
+          </w:r>
+        </w:p>
+      </w:docPartBody>
+    </w:docPart>
+    <w:docPart>
+      <w:docPartPr>
+        <w:name w:val="F0A2C5069A704B43895A349CCA78D31C"/>
+        <w:category>
+          <w:name w:val="Общие"/>
+          <w:gallery w:val="placeholder"/>
+        </w:category>
+        <w:types>
+          <w:type w:val="bbPlcHdr"/>
+        </w:types>
+        <w:behaviors>
+          <w:behavior w:val="content"/>
+        </w:behaviors>
+        <w:guid w:val="{E3534E43-2B07-42DE-9B20-53EFDD47368C}"/>
+      </w:docPartPr>
+      <w:docPartBody>
+        <w:p>
+          <w:pPr>
+            <w:pStyle w:val="F0A2C5069A704B43895A349CCA78D31C"/>
+          </w:pPr>
+          <w:r>
+            <w:rPr>
+              <w:rStyle w:val="a3"/>
+            </w:rPr>
+            <w:t>Место для ввода текста.</w:t>
+          </w:r>
+        </w:p>
+      </w:docPartBody>
+    </w:docPart>
+    <w:docPart>
+      <w:docPartPr>
+        <w:name w:val="FB5EA45044FD4518848018693794797E"/>
+        <w:category>
+          <w:name w:val="Общие"/>
+          <w:gallery w:val="placeholder"/>
+        </w:category>
+        <w:types>
+          <w:type w:val="bbPlcHdr"/>
+        </w:types>
+        <w:behaviors>
+          <w:behavior w:val="content"/>
+        </w:behaviors>
+        <w:guid w:val="{6351B133-3F7A-42E0-8617-947B06DDED93}"/>
+      </w:docPartPr>
+      <w:docPartBody>
+        <w:p>
+          <w:pPr>
+            <w:pStyle w:val="FB5EA45044FD4518848018693794797E"/>
+          </w:pPr>
+          <w:r>
+            <w:rPr>
+              <w:rStyle w:val="a3"/>
+            </w:rPr>
+            <w:t>Место для ввода текста.</w:t>
+          </w:r>
+        </w:p>
+      </w:docPartBody>
+    </w:docPart>
+    <w:docPart>
+      <w:docPartPr>
+        <w:name w:val="D948EFB7A8D345D189F3B1985D70A1C6"/>
+        <w:category>
+          <w:name w:val="Общие"/>
+          <w:gallery w:val="placeholder"/>
+        </w:category>
+        <w:types>
+          <w:type w:val="bbPlcHdr"/>
+        </w:types>
+        <w:behaviors>
+          <w:behavior w:val="content"/>
+        </w:behaviors>
+        <w:guid w:val="{E2292659-4402-4CD0-9D89-36F97A72B568}"/>
+      </w:docPartPr>
+      <w:docPartBody>
+        <w:p>
+          <w:pPr>
+            <w:pStyle w:val="D948EFB7A8D345D189F3B1985D70A1C6"/>
+          </w:pPr>
+          <w:r>
+            <w:rPr>
+              <w:rStyle w:val="a3"/>
+            </w:rPr>
+            <w:t>Место для ввода текста.</w:t>
+          </w:r>
+        </w:p>
+      </w:docPartBody>
+    </w:docPart>
+    <w:docPart>
+      <w:docPartPr>
+        <w:name w:val="04FA96F9E0714A00A650074D6BAB007A"/>
+        <w:category>
+          <w:name w:val="Общие"/>
+          <w:gallery w:val="placeholder"/>
+        </w:category>
+        <w:types>
+          <w:type w:val="bbPlcHdr"/>
+        </w:types>
+        <w:behaviors>
+          <w:behavior w:val="content"/>
+        </w:behaviors>
+        <w:guid w:val="{E26BDA32-5C95-45BD-B5A8-DA4673AAC3DB}"/>
+      </w:docPartPr>
+      <w:docPartBody>
+        <w:p>
+          <w:pPr>
+            <w:pStyle w:val="04FA96F9E0714A00A650074D6BAB007A"/>
+          </w:pPr>
+          <w:r>
+            <w:rPr>
+              <w:rStyle w:val="a3"/>
+            </w:rPr>
+            <w:t>Место для ввода текста.</w:t>
+          </w:r>
+        </w:p>
+      </w:docPartBody>
+    </w:docPart>
+    <w:docPart>
+      <w:docPartPr>
+        <w:name w:val="3E7D4BEFBDDE4B9EA17B988F058BC7CE"/>
+        <w:category>
+          <w:name w:val="Общие"/>
+          <w:gallery w:val="placeholder"/>
+        </w:category>
+        <w:types>
+          <w:type w:val="bbPlcHdr"/>
+        </w:types>
+        <w:behaviors>
+          <w:behavior w:val="content"/>
+        </w:behaviors>
+        <w:guid w:val="{53F9B3AF-0F66-4D78-BF93-DC34316A6186}"/>
+      </w:docPartPr>
+      <w:docPartBody>
+        <w:p>
+          <w:pPr>
+            <w:pStyle w:val="3E7D4BEFBDDE4B9EA17B988F058BC7CE"/>
+          </w:pPr>
+          <w:r>
+            <w:rPr>
+              <w:rStyle w:val="a3"/>
+            </w:rPr>
+            <w:t>Место для ввода текста.</w:t>
+          </w:r>
+        </w:p>
+      </w:docPartBody>
+    </w:docPart>
+    <w:docPart>
+      <w:docPartPr>
+        <w:name w:val="0C8C586799AD451993087FF0A7EED967"/>
+        <w:category>
+          <w:name w:val="Общие"/>
+          <w:gallery w:val="placeholder"/>
+        </w:category>
+        <w:types>
+          <w:type w:val="bbPlcHdr"/>
+        </w:types>
+        <w:behaviors>
+          <w:behavior w:val="content"/>
+        </w:behaviors>
+        <w:guid w:val="{6AB1A054-0AC0-423A-8296-E6614DAFD90F}"/>
+      </w:docPartPr>
+      <w:docPartBody>
+        <w:p>
+          <w:pPr>
+            <w:pStyle w:val="0C8C586799AD451993087FF0A7EED967"/>
+          </w:pPr>
+          <w:r>
+            <w:rPr>
+              <w:rStyle w:val="a3"/>
+            </w:rPr>
+            <w:t>Место для ввода текста.</w:t>
+          </w:r>
+        </w:p>
+      </w:docPartBody>
+    </w:docPart>
+    <w:docPart>
+      <w:docPartPr>
+        <w:name w:val="30D6536E80784AAD9BD4C7636F840AA7"/>
+        <w:category>
+          <w:name w:val="Общие"/>
+          <w:gallery w:val="placeholder"/>
+        </w:category>
+        <w:types>
+          <w:type w:val="bbPlcHdr"/>
+        </w:types>
+        <w:behaviors>
+          <w:behavior w:val="content"/>
+        </w:behaviors>
+        <w:guid w:val="{515825F1-450A-456B-A2A9-49696D83CEBD}"/>
+      </w:docPartPr>
+      <w:docPartBody>
+        <w:p>
+          <w:pPr>
+            <w:pStyle w:val="30D6536E80784AAD9BD4C7636F840AA7"/>
+          </w:pPr>
+          <w:r>
+            <w:rPr>
+              <w:rStyle w:val="a3"/>
+            </w:rPr>
+            <w:t>Место для ввода текста.</w:t>
+          </w:r>
+        </w:p>
+      </w:docPartBody>
+    </w:docPart>
+    <w:docPart>
+      <w:docPartPr>
+        <w:name w:val="BA63E205CD5942F6ACB2FA8EACAECE45"/>
+        <w:category>
+          <w:name w:val="Общие"/>
+          <w:gallery w:val="placeholder"/>
+        </w:category>
+        <w:types>
+          <w:type w:val="bbPlcHdr"/>
+        </w:types>
+        <w:behaviors>
+          <w:behavior w:val="content"/>
+        </w:behaviors>
+        <w:guid w:val="{E9295001-A6E3-4769-B9F2-C49D4A8CD4C5}"/>
+      </w:docPartPr>
+      <w:docPartBody>
+        <w:p>
+          <w:pPr>
+            <w:pStyle w:val="BA63E205CD5942F6ACB2FA8EACAECE45"/>
+          </w:pPr>
+          <w:r>
+            <w:rPr>
+              <w:rStyle w:val="a3"/>
+            </w:rPr>
+            <w:t>Место для ввода текста.</w:t>
+          </w:r>
+        </w:p>
+      </w:docPartBody>
+    </w:docPart>
   </w:docParts>
 </w:glossaryDocument>
 </file>
@@ -28372,7 +28840,7 @@
     <w:charset w:val="00"/>
     <w:family w:val="roman"/>
     <w:pitch w:val="variable"/>
-    <w:sig w:usb0="E0002AFF" w:usb1="C0007843" w:usb2="00000009" w:usb3="00000000" w:csb0="000001FF" w:csb1="00000000"/>
+    <w:sig w:usb0="E0002EFF" w:usb1="C000785B" w:usb2="00000009" w:usb3="00000000" w:csb0="000001FF" w:csb1="00000000"/>
   </w:font>
   <w:font w:name="Symbol">
     <w:panose1 w:val="05050102010706020507"/>
@@ -28397,10 +28865,10 @@
   </w:font>
   <w:font w:name="Calibri">
     <w:panose1 w:val="020F0502020204030204"/>
-    <w:charset w:val="00"/>
+    <w:charset w:val="CC"/>
     <w:family w:val="swiss"/>
     <w:pitch w:val="variable"/>
-    <w:sig w:usb0="E0002AFF" w:usb1="4000ACFF" w:usb2="00000001" w:usb3="00000000" w:csb0="000001FF" w:csb1="00000000"/>
+    <w:sig w:usb0="E4002EFF" w:usb1="C200247B" w:usb2="00000009" w:usb3="00000000" w:csb0="000001FF" w:csb1="00000000"/>
   </w:font>
   <w:font w:name="Cambria">
     <w:panose1 w:val="02040503050406030204"/>
@@ -28421,14 +28889,14 @@
     <w:charset w:val="00"/>
     <w:family w:val="swiss"/>
     <w:pitch w:val="variable"/>
-    <w:sig w:usb0="E0002AFF" w:usb1="C0007843" w:usb2="00000009" w:usb3="00000000" w:csb0="000001FF" w:csb1="00000000"/>
+    <w:sig w:usb0="E0002EFF" w:usb1="C000785B" w:usb2="00000009" w:usb3="00000000" w:csb0="000001FF" w:csb1="00000000"/>
   </w:font>
   <w:font w:name="Calibri Light">
     <w:panose1 w:val="020F0302020204030204"/>
-    <w:charset w:val="00"/>
+    <w:charset w:val="CC"/>
     <w:family w:val="swiss"/>
     <w:pitch w:val="variable"/>
-    <w:sig w:usb0="A0002AEF" w:usb1="4000207B" w:usb2="00000000" w:usb3="00000000" w:csb0="000001FF" w:csb1="00000000"/>
+    <w:sig w:usb0="E4002EFF" w:usb1="C200247B" w:usb2="00000009" w:usb3="00000000" w:csb0="000001FF" w:csb1="00000000"/>
   </w:font>
   <w:font w:name="MS Gothic">
     <w:altName w:val="ＭＳ ゴシック"/>
@@ -28471,6 +28939,7 @@
   </w:compat>
   <w:rsids>
     <w:rsidRoot w:val="00EC6E2E"/>
+    <w:rsid w:val="00034FB9"/>
     <w:rsid w:val="0004186D"/>
     <w:rsid w:val="000B3288"/>
     <w:rsid w:val="000F7952"/>
@@ -28479,15 +28948,18 @@
     <w:rsid w:val="001548AF"/>
     <w:rsid w:val="0015781E"/>
     <w:rsid w:val="00161281"/>
+    <w:rsid w:val="00172134"/>
     <w:rsid w:val="001B085C"/>
     <w:rsid w:val="00222FCC"/>
     <w:rsid w:val="002234A2"/>
     <w:rsid w:val="0022586E"/>
     <w:rsid w:val="002E32E4"/>
+    <w:rsid w:val="002F75D8"/>
     <w:rsid w:val="00301474"/>
     <w:rsid w:val="0032338D"/>
     <w:rsid w:val="00334991"/>
     <w:rsid w:val="00341460"/>
+    <w:rsid w:val="003429B7"/>
     <w:rsid w:val="003473D0"/>
     <w:rsid w:val="0036093E"/>
     <w:rsid w:val="00383679"/>
@@ -28500,6 +28972,7 @@
     <w:rsid w:val="00482A4F"/>
     <w:rsid w:val="00496262"/>
     <w:rsid w:val="00496CD3"/>
+    <w:rsid w:val="004B6A3D"/>
     <w:rsid w:val="004C0405"/>
     <w:rsid w:val="004F48F4"/>
     <w:rsid w:val="0054338E"/>
@@ -28514,16 +28987,20 @@
     <w:rsid w:val="006D2117"/>
     <w:rsid w:val="006D70DB"/>
     <w:rsid w:val="006E301C"/>
+    <w:rsid w:val="00733E93"/>
+    <w:rsid w:val="007523D9"/>
     <w:rsid w:val="00793841"/>
     <w:rsid w:val="007A2208"/>
     <w:rsid w:val="008568AE"/>
     <w:rsid w:val="00895A16"/>
     <w:rsid w:val="0089646B"/>
     <w:rsid w:val="008B6AFA"/>
+    <w:rsid w:val="008C3E57"/>
     <w:rsid w:val="008C64D6"/>
     <w:rsid w:val="008D5632"/>
     <w:rsid w:val="008F7EFA"/>
     <w:rsid w:val="00936A97"/>
+    <w:rsid w:val="0094327E"/>
     <w:rsid w:val="00983331"/>
     <w:rsid w:val="00987BD2"/>
     <w:rsid w:val="00991C9C"/>
@@ -28535,19 +29012,24 @@
     <w:rsid w:val="00A31763"/>
     <w:rsid w:val="00A37A20"/>
     <w:rsid w:val="00A6198B"/>
+    <w:rsid w:val="00B21112"/>
     <w:rsid w:val="00B5435B"/>
     <w:rsid w:val="00B63816"/>
     <w:rsid w:val="00B66477"/>
+    <w:rsid w:val="00BD36D8"/>
     <w:rsid w:val="00C10959"/>
     <w:rsid w:val="00C14CD6"/>
     <w:rsid w:val="00C64ACF"/>
+    <w:rsid w:val="00CB2B50"/>
     <w:rsid w:val="00CD19C9"/>
     <w:rsid w:val="00CF1004"/>
     <w:rsid w:val="00D122CB"/>
     <w:rsid w:val="00D40919"/>
+    <w:rsid w:val="00DA152E"/>
     <w:rsid w:val="00DC1856"/>
     <w:rsid w:val="00DC33D6"/>
     <w:rsid w:val="00DF152C"/>
+    <w:rsid w:val="00E058EB"/>
     <w:rsid w:val="00E429B7"/>
     <w:rsid w:val="00E511F3"/>
     <w:rsid w:val="00E95897"/>
@@ -28555,6 +29037,7 @@
     <w:rsid w:val="00EC6E2E"/>
     <w:rsid w:val="00EE1FBF"/>
     <w:rsid w:val="00EF1414"/>
+    <w:rsid w:val="00EF42A8"/>
     <w:rsid w:val="00F25C9D"/>
     <w:rsid w:val="00F47885"/>
     <w:rsid w:val="00F663FA"/>
@@ -29013,7 +29496,7 @@
     <w:basedOn w:val="a0"/>
     <w:uiPriority w:val="99"/>
     <w:semiHidden/>
-    <w:rsid w:val="0036093E"/>
+    <w:rsid w:val="003429B7"/>
     <w:rPr>
       <w:color w:val="808080"/>
     </w:rPr>
@@ -29293,6 +29776,142 @@
   <w:style w:type="paragraph" w:customStyle="1" w:styleId="DEE27F533D294CAABC64E171D6308531">
     <w:name w:val="DEE27F533D294CAABC64E171D6308531"/>
     <w:rsid w:val="0036093E"/>
+  </w:style>
+  <w:style w:type="paragraph" w:customStyle="1" w:styleId="F6CCE77BACA74FF8BAE9FCC07E9C6214">
+    <w:name w:val="F6CCE77BACA74FF8BAE9FCC07E9C6214"/>
+    <w:rsid w:val="00E058EB"/>
+  </w:style>
+  <w:style w:type="paragraph" w:customStyle="1" w:styleId="80111B77C3E8480E9EA1C09392EFE7C1">
+    <w:name w:val="80111B77C3E8480E9EA1C09392EFE7C1"/>
+    <w:rsid w:val="00E058EB"/>
+  </w:style>
+  <w:style w:type="paragraph" w:customStyle="1" w:styleId="46A91DD9D54F493F82E7106993FD8C1F">
+    <w:name w:val="46A91DD9D54F493F82E7106993FD8C1F"/>
+    <w:rsid w:val="00E058EB"/>
+  </w:style>
+  <w:style w:type="paragraph" w:customStyle="1" w:styleId="559B75C8826E41D7BACE5E158D29CD39">
+    <w:name w:val="559B75C8826E41D7BACE5E158D29CD39"/>
+    <w:rsid w:val="00E058EB"/>
+  </w:style>
+  <w:style w:type="paragraph" w:customStyle="1" w:styleId="0ED30F265A28418C99B4CF55A6D6BD06">
+    <w:name w:val="0ED30F265A28418C99B4CF55A6D6BD06"/>
+    <w:rsid w:val="00E058EB"/>
+  </w:style>
+  <w:style w:type="paragraph" w:customStyle="1" w:styleId="8B02D3335CBF40D49A29BE24FD8270BA">
+    <w:name w:val="8B02D3335CBF40D49A29BE24FD8270BA"/>
+    <w:rsid w:val="00E058EB"/>
+  </w:style>
+  <w:style w:type="paragraph" w:customStyle="1" w:styleId="ABC2DED8A9514E579F0BA2FEB99A8730">
+    <w:name w:val="ABC2DED8A9514E579F0BA2FEB99A8730"/>
+    <w:rsid w:val="00E058EB"/>
+  </w:style>
+  <w:style w:type="paragraph" w:customStyle="1" w:styleId="78D22587563148A1A4EE593F5BB49933">
+    <w:name w:val="78D22587563148A1A4EE593F5BB49933"/>
+    <w:rsid w:val="00E058EB"/>
+  </w:style>
+  <w:style w:type="paragraph" w:customStyle="1" w:styleId="3F13219D97324174B0254E366E929172">
+    <w:name w:val="3F13219D97324174B0254E366E929172"/>
+    <w:rsid w:val="00E058EB"/>
+  </w:style>
+  <w:style w:type="paragraph" w:customStyle="1" w:styleId="F6CA4010656243188BBDD3CEED45FCBE">
+    <w:name w:val="F6CA4010656243188BBDD3CEED45FCBE"/>
+    <w:rsid w:val="00E058EB"/>
+  </w:style>
+  <w:style w:type="paragraph" w:customStyle="1" w:styleId="E30BDC465383468FACAE7B1FD5729A4B">
+    <w:name w:val="E30BDC465383468FACAE7B1FD5729A4B"/>
+    <w:rsid w:val="00E058EB"/>
+  </w:style>
+  <w:style w:type="paragraph" w:customStyle="1" w:styleId="4C5CD62A19644D28B2AE5ED148A74503">
+    <w:name w:val="4C5CD62A19644D28B2AE5ED148A74503"/>
+    <w:rsid w:val="00E058EB"/>
+  </w:style>
+  <w:style w:type="paragraph" w:customStyle="1" w:styleId="BDBDFBC07C7A4E05996BAC4F14EFA1B6">
+    <w:name w:val="BDBDFBC07C7A4E05996BAC4F14EFA1B6"/>
+    <w:rsid w:val="00E058EB"/>
+  </w:style>
+  <w:style w:type="paragraph" w:customStyle="1" w:styleId="7B75A27B1766406481E569A14702411D">
+    <w:name w:val="7B75A27B1766406481E569A14702411D"/>
+    <w:rsid w:val="00E058EB"/>
+  </w:style>
+  <w:style w:type="paragraph" w:customStyle="1" w:styleId="46F05E5CAF0A463FBD9017276A674673">
+    <w:name w:val="46F05E5CAF0A463FBD9017276A674673"/>
+    <w:rsid w:val="00034FB9"/>
+  </w:style>
+  <w:style w:type="paragraph" w:customStyle="1" w:styleId="D83C14F00CEA433B8BAA6617381E4284">
+    <w:name w:val="D83C14F00CEA433B8BAA6617381E4284"/>
+    <w:rsid w:val="00034FB9"/>
+  </w:style>
+  <w:style w:type="paragraph" w:customStyle="1" w:styleId="11576E0D8CDF41699C77E5D3F44308A9">
+    <w:name w:val="11576E0D8CDF41699C77E5D3F44308A9"/>
+    <w:rsid w:val="00034FB9"/>
+  </w:style>
+  <w:style w:type="paragraph" w:customStyle="1" w:styleId="92A3724C014543AFABF462BE25EDA8B5">
+    <w:name w:val="92A3724C014543AFABF462BE25EDA8B5"/>
+    <w:rsid w:val="0094327E"/>
+  </w:style>
+  <w:style w:type="paragraph" w:customStyle="1" w:styleId="E441322B66FA400B8D89464168220C04">
+    <w:name w:val="E441322B66FA400B8D89464168220C04"/>
+    <w:rsid w:val="00DA152E"/>
+  </w:style>
+  <w:style w:type="paragraph" w:customStyle="1" w:styleId="BE5808D8654F4D4D8ADF8498985F0C13">
+    <w:name w:val="BE5808D8654F4D4D8ADF8498985F0C13"/>
+    <w:rsid w:val="003429B7"/>
+  </w:style>
+  <w:style w:type="paragraph" w:customStyle="1" w:styleId="5A312808E0304D3EAB0E6ECA4C8C681D">
+    <w:name w:val="5A312808E0304D3EAB0E6ECA4C8C681D"/>
+    <w:rsid w:val="003429B7"/>
+  </w:style>
+  <w:style w:type="paragraph" w:customStyle="1" w:styleId="A63155A05D324CB58288C07D1C32250B">
+    <w:name w:val="A63155A05D324CB58288C07D1C32250B"/>
+    <w:rsid w:val="003429B7"/>
+  </w:style>
+  <w:style w:type="paragraph" w:customStyle="1" w:styleId="6BF8A317488C4FECA42C94E37250B4F2">
+    <w:name w:val="6BF8A317488C4FECA42C94E37250B4F2"/>
+    <w:rsid w:val="003429B7"/>
+  </w:style>
+  <w:style w:type="paragraph" w:customStyle="1" w:styleId="F0A2C5069A704B43895A349CCA78D31C">
+    <w:name w:val="F0A2C5069A704B43895A349CCA78D31C"/>
+    <w:rsid w:val="003429B7"/>
+  </w:style>
+  <w:style w:type="paragraph" w:customStyle="1" w:styleId="D799C4F2BC094C08A56117A2BADF4F89">
+    <w:name w:val="D799C4F2BC094C08A56117A2BADF4F89"/>
+    <w:rsid w:val="003429B7"/>
+  </w:style>
+  <w:style w:type="paragraph" w:customStyle="1" w:styleId="FB5EA45044FD4518848018693794797E">
+    <w:name w:val="FB5EA45044FD4518848018693794797E"/>
+    <w:rsid w:val="003429B7"/>
+  </w:style>
+  <w:style w:type="paragraph" w:customStyle="1" w:styleId="D948EFB7A8D345D189F3B1985D70A1C6">
+    <w:name w:val="D948EFB7A8D345D189F3B1985D70A1C6"/>
+    <w:rsid w:val="003429B7"/>
+  </w:style>
+  <w:style w:type="paragraph" w:customStyle="1" w:styleId="04FA96F9E0714A00A650074D6BAB007A">
+    <w:name w:val="04FA96F9E0714A00A650074D6BAB007A"/>
+    <w:rsid w:val="003429B7"/>
+  </w:style>
+  <w:style w:type="paragraph" w:customStyle="1" w:styleId="3E7D4BEFBDDE4B9EA17B988F058BC7CE">
+    <w:name w:val="3E7D4BEFBDDE4B9EA17B988F058BC7CE"/>
+    <w:rsid w:val="003429B7"/>
+  </w:style>
+  <w:style w:type="paragraph" w:customStyle="1" w:styleId="0C8C586799AD451993087FF0A7EED967">
+    <w:name w:val="0C8C586799AD451993087FF0A7EED967"/>
+    <w:rsid w:val="003429B7"/>
+  </w:style>
+  <w:style w:type="paragraph" w:customStyle="1" w:styleId="30D6536E80784AAD9BD4C7636F840AA7">
+    <w:name w:val="30D6536E80784AAD9BD4C7636F840AA7"/>
+    <w:rsid w:val="003429B7"/>
+  </w:style>
+  <w:style w:type="paragraph" w:customStyle="1" w:styleId="BA63E205CD5942F6ACB2FA8EACAECE45">
+    <w:name w:val="BA63E205CD5942F6ACB2FA8EACAECE45"/>
+    <w:rsid w:val="003429B7"/>
+  </w:style>
+  <w:style w:type="paragraph" w:customStyle="1" w:styleId="F96E42542CB14821A4799702BBD063DC">
+    <w:name w:val="F96E42542CB14821A4799702BBD063DC"/>
+    <w:rsid w:val="003429B7"/>
+  </w:style>
+  <w:style w:type="paragraph" w:customStyle="1" w:styleId="228CD4D0493842F88D051FF135F7155A">
+    <w:name w:val="228CD4D0493842F88D051FF135F7155A"/>
+    <w:rsid w:val="003429B7"/>
   </w:style>
 </w:styles>
 </file>
@@ -29604,7 +30223,7 @@
 </file>
 
 <file path=customXml/itemProps1.xml><?xml version="1.0" encoding="utf-8"?>
-<ds:datastoreItem xmlns:ds="http://schemas.openxmlformats.org/officeDocument/2006/customXml" ds:itemID="{5DE24610-26D5-4542-B994-E5C83782693C}">
+<ds:datastoreItem xmlns:ds="http://schemas.openxmlformats.org/officeDocument/2006/customXml" ds:itemID="{B73DD691-D492-4415-BF33-BDD798401922}">
   <ds:schemaRefs>
     <ds:schemaRef ds:uri="http://schemas.openxmlformats.org/officeDocument/2006/bibliography"/>
   </ds:schemaRefs>

</xml_diff>